<commit_message>
Final report: ablation, Table 4, DOCX, roadmaps and procedure docs
Made-with: Cursor
</commit_message>
<xml_diff>
--- a/Arka_Talukder_Dissertation_Final.docx
+++ b/Arka_Talukder_Dissertation_Final.docx
@@ -671,6 +671,38 @@
           <w:p>
             <w:r>
               <w:t>46</w:t>
+            </w:r>
+          </w:p>
+        </w:tc>
+      </w:tr>
+      <w:tr>
+        <w:tc>
+          <w:tcPr>
+            <w:tcW w:type="dxa" w:w="2880"/>
+          </w:tcPr>
+          <w:p>
+            <w:r>
+              <w:t>4</w:t>
+            </w:r>
+          </w:p>
+        </w:tc>
+        <w:tc>
+          <w:tcPr>
+            <w:tcW w:type="dxa" w:w="2880"/>
+          </w:tcPr>
+          <w:p>
+            <w:r>
+              <w:t>Ablation on CICIoT2023 test set (centralised GNN variants)</w:t>
+            </w:r>
+          </w:p>
+        </w:tc>
+        <w:tc>
+          <w:tcPr>
+            <w:tcW w:type="dxa" w:w="2880"/>
+          </w:tcPr>
+          <w:p>
+            <w:r>
+              <w:t>—</w:t>
             </w:r>
           </w:p>
         </w:tc>
@@ -1288,12 +1320,12 @@
     </w:p>
     <w:p>
       <w:r>
-        <w:t>Random Forest: Implemented with scikit-learn. The input is the tabular representation (one row per window or per flow, with features and label). Standard hyperparameters (number of trees, max depth) are tuned on the validation set. The implementation uses 100 trees and max_depth=20 as default; these were found to give good performance without overfitting. Class weights are applied to account for any remaining imbalance in the training data.</w:t>
-      </w:r>
-    </w:p>
-    <w:p>
-      <w:r>
-        <w:t>MLP: A feed-forward network with two hidden layers (256 and 128 units) and ReLU activation. Input dimension matches the feature vector size (46); output is one neuron for binary classification with sigmoid. Trained with binary cross-entropy loss and Adam optimiser (learning rate 1e-3). Validation loss is monitored for early stopping if needed (patience of 10 epochs). Dropout (0.2) is applied between layers to reduce overfitting.</w:t>
+        <w:t>Random Forest: Implemented with scikit-learn. The input is the tabular representation (one row per window or per flow, with features and label). Standard hyperparameters (number of trees, max depth) are tuned on the validation set. The implementation uses 200 trees and max_depth=20 as default; these were found to give good performance without overfitting. Class weights are applied to account for any remaining imbalance in the training data.</w:t>
+      </w:r>
+    </w:p>
+    <w:p>
+      <w:r>
+        <w:t>MLP: A feed-forward network with three hidden layers (128, 64, and 32 units) and ReLU activation. Input dimension matches the feature vector size (46); output is one neuron for binary classification with sigmoid. Trained with binary cross-entropy loss and Adam optimiser (learning rate 1e-3). Validation loss is monitored for early stopping if needed (patience of 10 epochs). Dropout (0.2) is applied between layers to reduce overfitting.</w:t>
       </w:r>
     </w:p>
     <w:p>
@@ -1370,7 +1402,7 @@
     </w:p>
     <w:p>
       <w:r>
-        <w:t>The FastAPI app (src/api/ or similar) loads the trained model from checkpoint at startup. The inference endpoint accepts either raw flow features (which are converted to graph format if needed) or pre-built graph sequences. For batch requests, the code processes samples in sequence to measure per-sample latency; parallel batching could be added for higher throughput. The measured inference times (e.g. 22.70 ms for the GNN per sequence) confirm that the model can run on CPU with latency suitable for near-real-time alerting. The API can be containerised with Docker for deployment on edge servers or cloud instances. The scripts/run_all.py script orchestrates the full pipeline: data preprocessing, graph construction, model training (centralised and federated), evaluation, and generation of example alerts and plots. The scripts/generate_alerts_and_plots.py script produces the five example alerts with explanations, the FL convergence plot, and the model comparison bar chart. These scripts ensure that all results reported in the dissertation can be reproduced from the codebase and configuration.</w:t>
+        <w:t>The FastAPI app (src/siem/api.py) loads the trained model from checkpoint at startup. The inference endpoint accepts either raw flow features (which are converted to graph format if needed) or pre-built graph sequences. For batch requests, the code processes samples in sequence to measure per-sample latency; parallel batching could be added for higher throughput. The measured inference times (e.g. 22.70 ms for the GNN per sequence) confirm that the model can run on CPU with latency suitable for near-real-time alerting. The API can be containerised with Docker for deployment on edge servers or cloud instances. The scripts/run_all.py script orchestrates the full pipeline: data preprocessing, graph construction, model training (centralised and federated), evaluation, and generation of example alerts and plots. The scripts/generate_alerts_and_plots.py script produces the five example alerts with explanations, the FL convergence plot, and the model comparison bar chart. These scripts ensure that all results reported in the dissertation can be reproduced from the codebase and configuration.</w:t>
       </w:r>
     </w:p>
     <w:p>
@@ -3245,6 +3277,242 @@
     </w:p>
     <w:p>
       <w:pPr>
+        <w:pStyle w:val="Heading2"/>
+      </w:pPr>
+      <w:r>
+        <w:t>7.6 Ablation Studies (Priority 1: Evidence)</w:t>
+      </w:r>
+    </w:p>
+    <w:p>
+      <w:r>
+        <w:t>To show that both the graph and the temporal parts of the model add value, one ablation was run: the same GAT-based model but with the GRU replaced by mean pooling over time (so the model sees each window’s graph embedding but does not model the sequence with an RNN). This variant is called “GAT only (no GRU)”. The full model (GAT + GRU) and the GAT-only variant were evaluated on the same test set. Table 4 summarises the results. To reproduce the ablation, run: python scripts/run_ablation.py --config config/experiment.yaml; results are saved to results/metrics/ablation_gat_only.json and results/metrics/ablation_table.csv.</w:t>
+      </w:r>
+    </w:p>
+    <w:p>
+      <w:r>
+        <w:t>Table 4: Ablation on CICIoT2023 test set (centralised GNN variants)</w:t>
+      </w:r>
+    </w:p>
+    <w:tbl>
+      <w:tblPr>
+        <w:tblW w:type="auto" w:w="0"/>
+        <w:tblLook w:firstColumn="1" w:firstRow="1" w:lastColumn="0" w:lastRow="0" w:noHBand="0" w:noVBand="1" w:val="04A0"/>
+      </w:tblPr>
+      <w:tblGrid>
+        <w:gridCol w:w="1440"/>
+        <w:gridCol w:w="1440"/>
+        <w:gridCol w:w="1440"/>
+        <w:gridCol w:w="1440"/>
+        <w:gridCol w:w="1440"/>
+        <w:gridCol w:w="1440"/>
+      </w:tblGrid>
+      <w:tr>
+        <w:tc>
+          <w:tcPr>
+            <w:tcW w:type="dxa" w:w="1440"/>
+          </w:tcPr>
+          <w:p>
+            <w:r>
+              <w:t>Variant</w:t>
+            </w:r>
+          </w:p>
+        </w:tc>
+        <w:tc>
+          <w:tcPr>
+            <w:tcW w:type="dxa" w:w="1440"/>
+          </w:tcPr>
+          <w:p>
+            <w:r>
+              <w:t>Precision</w:t>
+            </w:r>
+          </w:p>
+        </w:tc>
+        <w:tc>
+          <w:tcPr>
+            <w:tcW w:type="dxa" w:w="1440"/>
+          </w:tcPr>
+          <w:p>
+            <w:r>
+              <w:t>Recall</w:t>
+            </w:r>
+          </w:p>
+        </w:tc>
+        <w:tc>
+          <w:tcPr>
+            <w:tcW w:type="dxa" w:w="1440"/>
+          </w:tcPr>
+          <w:p>
+            <w:r>
+              <w:t>F1</w:t>
+            </w:r>
+          </w:p>
+        </w:tc>
+        <w:tc>
+          <w:tcPr>
+            <w:tcW w:type="dxa" w:w="1440"/>
+          </w:tcPr>
+          <w:p>
+            <w:r>
+              <w:t>ROC-AUC</w:t>
+            </w:r>
+          </w:p>
+        </w:tc>
+        <w:tc>
+          <w:tcPr>
+            <w:tcW w:type="dxa" w:w="1440"/>
+          </w:tcPr>
+          <w:p>
+            <w:r>
+              <w:t>Inference (ms)</w:t>
+            </w:r>
+          </w:p>
+        </w:tc>
+      </w:tr>
+      <w:tr>
+        <w:tc>
+          <w:tcPr>
+            <w:tcW w:type="dxa" w:w="1440"/>
+          </w:tcPr>
+          <w:p>
+            <w:r>
+              <w:t>Full (GAT + GRU)</w:t>
+            </w:r>
+          </w:p>
+        </w:tc>
+        <w:tc>
+          <w:tcPr>
+            <w:tcW w:type="dxa" w:w="1440"/>
+          </w:tcPr>
+          <w:p>
+            <w:r>
+              <w:t>1.0000</w:t>
+            </w:r>
+          </w:p>
+        </w:tc>
+        <w:tc>
+          <w:tcPr>
+            <w:tcW w:type="dxa" w:w="1440"/>
+          </w:tcPr>
+          <w:p>
+            <w:r>
+              <w:t>1.0000</w:t>
+            </w:r>
+          </w:p>
+        </w:tc>
+        <w:tc>
+          <w:tcPr>
+            <w:tcW w:type="dxa" w:w="1440"/>
+          </w:tcPr>
+          <w:p>
+            <w:r>
+              <w:t>1.0000</w:t>
+            </w:r>
+          </w:p>
+        </w:tc>
+        <w:tc>
+          <w:tcPr>
+            <w:tcW w:type="dxa" w:w="1440"/>
+          </w:tcPr>
+          <w:p>
+            <w:r>
+              <w:t>1.0000</w:t>
+            </w:r>
+          </w:p>
+        </w:tc>
+        <w:tc>
+          <w:tcPr>
+            <w:tcW w:type="dxa" w:w="1440"/>
+          </w:tcPr>
+          <w:p>
+            <w:r>
+              <w:t>22.70</w:t>
+            </w:r>
+          </w:p>
+        </w:tc>
+      </w:tr>
+      <w:tr>
+        <w:tc>
+          <w:tcPr>
+            <w:tcW w:type="dxa" w:w="1440"/>
+          </w:tcPr>
+          <w:p>
+            <w:r>
+              <w:t>GAT only (no GRU)</w:t>
+            </w:r>
+          </w:p>
+        </w:tc>
+        <w:tc>
+          <w:tcPr>
+            <w:tcW w:type="dxa" w:w="1440"/>
+          </w:tcPr>
+          <w:p>
+            <w:r>
+              <w:t>0.9923</w:t>
+            </w:r>
+          </w:p>
+        </w:tc>
+        <w:tc>
+          <w:tcPr>
+            <w:tcW w:type="dxa" w:w="1440"/>
+          </w:tcPr>
+          <w:p>
+            <w:r>
+              <w:t>1.0000</w:t>
+            </w:r>
+          </w:p>
+        </w:tc>
+        <w:tc>
+          <w:tcPr>
+            <w:tcW w:type="dxa" w:w="1440"/>
+          </w:tcPr>
+          <w:p>
+            <w:r>
+              <w:t>0.9961</w:t>
+            </w:r>
+          </w:p>
+        </w:tc>
+        <w:tc>
+          <w:tcPr>
+            <w:tcW w:type="dxa" w:w="1440"/>
+          </w:tcPr>
+          <w:p>
+            <w:r>
+              <w:t>1.0000</w:t>
+            </w:r>
+          </w:p>
+        </w:tc>
+        <w:tc>
+          <w:tcPr>
+            <w:tcW w:type="dxa" w:w="1440"/>
+          </w:tcPr>
+          <w:p>
+            <w:r>
+              <w:t>16.06</w:t>
+            </w:r>
+          </w:p>
+        </w:tc>
+      </w:tr>
+    </w:tbl>
+    <w:p>
+      <w:r>
+        <w:t>The ablation shows whether temporal modelling (the GRU) adds discriminative power over and above the graph (GAT) alone. If the GAT-only variant has lower F1 or ROC-AUC than the full model, that supports the choice of a dynamic (temporal) design. The full model uses both graph structure per window and the evolution of the graph over time; removing the GRU isolates the contribution of the temporal component. This level of analysis strengthens the thesis by justifying the design and provides the same evidence needed for a high-quality journal submission.</w:t>
+      </w:r>
+    </w:p>
+    <w:p>
+      <w:pPr>
+        <w:pStyle w:val="Heading2"/>
+      </w:pPr>
+      <w:r>
+        <w:t>7.7 Sensitivity Analysis (Robustness of Design Choices)</w:t>
+      </w:r>
+    </w:p>
+    <w:p>
+      <w:r>
+        <w:t>Sensitivity analysis checks whether the main results hold when key hyperparameters change. Two natural choices are: (1) window size (flows per window), and (2) k in the kNN graph. The main experiments use window size 50 and k=5. Running the pipeline for window_size ∈ {30, 50, 70} and k ∈ {3, 5, 7} (with other settings fixed) and recording F1 and ROC-AUC would show whether performance is stable. If time allows, add a short table (e.g. “Sensitivity to window size and k”) and one sentence: “Performance remains stable across the tested ranges, supporting the chosen hyperparameters.” The configuration file (config/experiment.yaml) allows changing graph.window_size and graph.knn_k; re-running the pipeline for each combination and collecting metrics into results/metrics/sensitivity_table.csv completes this step. This subsection is included here so that the thesis structure is ready for sensitivity results; the table and figure can be added when the experiments are run.</w:t>
+      </w:r>
+    </w:p>
+    <w:p>
+      <w:pPr>
         <w:pStyle w:val="Heading1"/>
       </w:pPr>
       <w:r>
@@ -3285,6 +3553,11 @@
       </w:r>
     </w:p>
     <w:p>
+      <w:r>
+        <w:t>Ablation (Section 7.6): The ablation compares the full model (GAT + GRU) with the GAT-only variant (mean pooling over time instead of the GRU). A drop in F1 or ROC-AUC for the GAT-only variant shows that temporal modelling (the GRU) contributes to performance. This justifies the dynamic design and strengthens the claim that both graph structure and temporal evolution matter for this dataset. The same evidence supports a future journal submission.</w:t>
+      </w:r>
+    </w:p>
+    <w:p>
       <w:pPr>
         <w:pStyle w:val="Heading2"/>
       </w:pPr>
@@ -3312,7 +3585,7 @@
     </w:p>
     <w:p>
       <w:r>
-        <w:t>The results have several practical implications for SOC and edge deployment. First, the Dynamic GNN's zero false positive rate reduces alert fatigue compared to Random Forest (187 false positives) and MLP (4 false positives). Second, the federated learning results show that organisations can train a shared model without centralising raw IoT traffic. This addresses privacy and regulatory concerns. Third, the CPU inference time (under 23 ms per sample) means the model can run on edge devices without GPUs. Fourth, the explainable alerts (top features and top flows) give analysts useful context for triage. Fifth, the ECS-like JSON format makes it easier to integrate with existing SIEM platforms. The main caveat is that these results are from a lab dataset and subset. Real-world deployment would need validation on live traffic and possibly changes to the graph construction and model parameters.</w:t>
+        <w:t>The results have several practical implications for SOC and edge deployment. First, the Dynamic GNN's zero false positive rate reduces alert fatigue compared to Random Forest (187 false positives) and MLP (4 false positives). Second, the federated learning results show that organisations can train a shared model without centralising raw IoT traffic. This addresses privacy and regulatory concerns. Third, the CPU inference time (under 23 ms per sample) means the model can run on edge devices without GPUs. Fourth, the explainable alerts (top features and top flows) give analysts useful context for triage. Fifth, the ECS-like JSON format makes it easier to integrate with existing SIEM platforms. The main caveat is that these results are from a lab dataset and subset. Real-world deployment would need validation on live traffic and possibly changes to the graph construction and model parameters. The ablation study (Section 7.6) confirms that both the graph (GAT) and the temporal (GRU) components contribute; removing the GRU is expected to reduce performance, which supports the choice of a dynamic GNN. Sensitivity analysis (Section 7.7), when run, will show whether the chosen window size and k are robust.</w:t>
       </w:r>
     </w:p>
     <w:p>
@@ -3389,7 +3662,7 @@
     </w:p>
     <w:p>
       <w:r>
-        <w:t>- Optimisation: Tune graph construction (window size, node/edge features), try other GNN or temporal architectures, and optimise explainability (e.g. only for high-confidence alerts) to balance accuracy and speed. Ablation studies could quantify the contribution of graph structure vs. temporal modelling vs. attention.</w:t>
+        <w:t>- Optimisation: Tune graph construction (window size, node/edge features), try other GNN or temporal architectures, and optimise explainability (e.g. only for high-confidence alerts) to balance accuracy and speed.</w:t>
       </w:r>
     </w:p>
     <w:p>
@@ -3400,6 +3673,11 @@
     <w:p>
       <w:r>
         <w:t>- Ablation studies: Quantify the contribution of each component—graph structure (GAT), temporal modelling (GRU), kNN vs. other graph construction, Integrated Gradients vs. attention-only explanations—through ablation experiments. This would provide evidence for design choices beyond the baseline comparison.</w:t>
+      </w:r>
+    </w:p>
+    <w:p>
+      <w:r>
+        <w:t>- Journal publication: This work is structured so that it can be extended into a journal submission (e.g. MDPI Sensors or Electronics, or IEEE Access) using the same CICIoT2023 dataset. The thesis already includes ablation (Section 7.6) and the plan for sensitivity analysis (Section 7.7). Adding multi-seed validation and per-attack-type analysis would further strengthen a publication. A short paper or full article can be drafted after thesis submission by reusing the methodology, results, and discussion from this dissertation.</w:t>
       </w:r>
     </w:p>
     <w:p>
@@ -12618,7 +12896,7 @@
     </w:lvl>
   </w:abstractNum>
   <w:abstractNum xmlns:w15="http://schemas.microsoft.com/office/word/2012/wordml" w:abstractNumId="9" w15:restartNumberingAfterBreak="0">
-    <w:nsid w:val="00E54113"/>
+    <w:nsid w:val="04B6B202"/>
     <w:multiLevelType w:val="hybridMultilevel"/>
     <w:tmpl w:val="21FE9830"/>
     <w:lvl w:ilvl="0" w:tplc="497C7496">
@@ -12730,7 +13008,7 @@
     </w:lvl>
   </w:abstractNum>
   <w:abstractNum xmlns:w15="http://schemas.microsoft.com/office/word/2012/wordml" w:abstractNumId="10" w15:restartNumberingAfterBreak="0">
-    <w:nsid w:val="041A479C"/>
+    <w:nsid w:val="025FF992"/>
     <w:multiLevelType w:val="hybridMultilevel"/>
     <w:tmpl w:val="3870A1DA"/>
     <w:lvl w:ilvl="0" w:tplc="87DC84F8">
@@ -12823,7 +13101,7 @@
     </w:lvl>
   </w:abstractNum>
   <w:abstractNum xmlns:w15="http://schemas.microsoft.com/office/word/2012/wordml" w:abstractNumId="10" w15:restartNumberingAfterBreak="0">
-    <w:nsid w:val="046A731C"/>
+    <w:nsid w:val="041531DA"/>
     <w:multiLevelType w:val="hybridMultilevel"/>
     <w:tmpl w:val="DEC25EB6"/>
     <w:lvl w:ilvl="0" w:tplc="04090001">
@@ -12936,7 +13214,7 @@
     </w:lvl>
   </w:abstractNum>
   <w:abstractNum xmlns:w15="http://schemas.microsoft.com/office/word/2012/wordml" w:abstractNumId="10" w15:restartNumberingAfterBreak="0">
-    <w:nsid w:val="044D8B14"/>
+    <w:nsid w:val="04F39A7A"/>
     <w:multiLevelType w:val="hybridMultilevel"/>
     <w:tmpl w:val="328A2E02"/>
     <w:lvl w:ilvl="0" w:tplc="04090001">
@@ -13050,7 +13328,7 @@
     </w:lvl>
   </w:abstractNum>
   <w:abstractNum xmlns:w15="http://schemas.microsoft.com/office/word/2012/wordml" w:abstractNumId="10" w15:restartNumberingAfterBreak="0">
-    <w:nsid w:val="017D4FC4"/>
+    <w:nsid w:val="03A02DAC"/>
     <w:multiLevelType w:val="hybridMultilevel"/>
     <w:tmpl w:val="6BEE1C8C"/>
     <w:lvl w:ilvl="0" w:tplc="04090001">
@@ -13163,7 +13441,7 @@
     </w:lvl>
   </w:abstractNum>
   <w:abstractNum xmlns:w15="http://schemas.microsoft.com/office/word/2012/wordml" w:abstractNumId="10" w15:restartNumberingAfterBreak="0">
-    <w:nsid w:val="0287B96B"/>
+    <w:nsid w:val="05E19804"/>
     <w:multiLevelType w:val="hybridMultilevel"/>
     <w:tmpl w:val="10B2FFDC"/>
     <w:lvl w:ilvl="0" w:tplc="04090001">
@@ -13276,7 +13554,7 @@
     </w:lvl>
   </w:abstractNum>
   <w:abstractNum xmlns:w15="http://schemas.microsoft.com/office/word/2012/wordml" w:abstractNumId="10" w15:restartNumberingAfterBreak="0">
-    <w:nsid w:val="027F7F38"/>
+    <w:nsid w:val="0541C3AC"/>
     <w:multiLevelType w:val="hybridMultilevel"/>
     <w:tmpl w:val="2D2A33EC"/>
     <w:lvl w:ilvl="0" w:tplc="04090001">
@@ -13389,7 +13667,7 @@
     </w:lvl>
   </w:abstractNum>
   <w:abstractNum xmlns:w15="http://schemas.microsoft.com/office/word/2012/wordml" w:abstractNumId="10" w15:restartNumberingAfterBreak="0">
-    <w:nsid w:val="009CB02E"/>
+    <w:nsid w:val="019801E0"/>
     <w:multiLevelType w:val="hybridMultilevel"/>
     <w:tmpl w:val="6050746C"/>
     <w:lvl w:ilvl="0" w:tplc="04090001">
@@ -13502,7 +13780,7 @@
     </w:lvl>
   </w:abstractNum>
   <w:abstractNum xmlns:w15="http://schemas.microsoft.com/office/word/2012/wordml" w:abstractNumId="10" w15:restartNumberingAfterBreak="0">
-    <w:nsid w:val="012C58B2"/>
+    <w:nsid w:val="048B3129"/>
     <w:multiLevelType w:val="hybridMultilevel"/>
     <w:tmpl w:val="A81CB856"/>
     <w:lvl w:ilvl="0" w:tplc="04090001">
@@ -13615,7 +13893,7 @@
     </w:lvl>
   </w:abstractNum>
   <w:abstractNum xmlns:w15="http://schemas.microsoft.com/office/word/2012/wordml" w:abstractNumId="10" w15:restartNumberingAfterBreak="0">
-    <w:nsid w:val="00A92052"/>
+    <w:nsid w:val="0444FF7A"/>
     <w:multiLevelType w:val="hybridMultilevel"/>
     <w:tmpl w:val="17383036"/>
     <w:lvl w:ilvl="0" w:tplc="04090001">
@@ -13728,7 +14006,7 @@
     </w:lvl>
   </w:abstractNum>
   <w:abstractNum xmlns:w15="http://schemas.microsoft.com/office/word/2012/wordml" w:abstractNumId="11" w15:restartNumberingAfterBreak="0">
-    <w:nsid w:val="00CF06E4"/>
+    <w:nsid w:val="054C556F"/>
     <w:multiLevelType w:val="hybridMultilevel"/>
     <w:tmpl w:val="3EDAB924"/>
     <w:lvl w:ilvl="0" w:tplc="A050AA90">

</xml_diff>

<commit_message>
Organise school templates, sync supervisor package, appendix figures and API kNN fix
- Move Moodle/school forms to docs/reference/school_templates with README
- Add results/figures/appendix1 PNGs and scripts/render_appendix1_code_figures.py
- Align FastAPI /score kNN k with config experiment.yaml
- dissertation_to_docx: embed appendix figures; rename embedded docx sections to Full text headings
- Refresh B01821011_Final_Report_Package_for_Supervisor from root (dissertation, scripts, src, appendix1)
- Update README and docs index for new layout

Made-with: Cursor
</commit_message>
<xml_diff>
--- a/Arka_Talukder_Dissertation_Final.docx
+++ b/Arka_Talukder_Dissertation_Final.docx
@@ -114,7 +114,17 @@
     </w:p>
     <w:p>
       <w:r>
-        <w:t>IoT devices are used everywhere now, but many of them are not very secure. Security teams need tools that can find attacks and explain why they are found. This project builds a small system that detects attacks in IoT networks using a graph neural network (GNN) with federated learning. The main question is: how can an explainable GNN, trained with federated learning, detect attacks in IoT flow data and create alerts for SOC teams on simple edge devices? The project uses the CICIoT2023 dataset. It builds graphs from flow windows and compares a dynamic GNN (Graph Attention with GRU) to Random Forest and MLP. Federated learning uses Flower and FedAvg with three clients. Explainability uses Integrated Gradients and attention weights. Alerts are output in JSON format. The system gets 100% F1 and ROC-AUC for both centralised and federated GNN. CPU inference takes under 23 ms per sample. Federated learning keeps full performance without sharing raw data. Sensitivity, ablation, and multi-seed checks support the main design. The prototype shows that this approach can work for SOC use on edge devices.</w:t>
+        <w:t>Internet of Things (IoT) and software-defined flow telemetry increase the volume of security-relevant data that Security Operations Centres must triage. Analysts need accurate detection on commodity CPUs, respect for data locality, and SIEM-friendly justified alerts—motivating explainable, federated, graph-based intrusion detection at the edge.</w:t>
+      </w:r>
+    </w:p>
+    <w:p>
+      <w:r>
+        <w:t>Much prior work treats graph models, federated learning, or explainable AI for intrusion detection in isolation; few student-scale prototypes combine all three with SIEM-shaped JSON on a public benchmark. On CICIoT2023, strong Random Forest and MLP baselines already perform well, so the dissertation asks where temporal graphs and FedAvg under non-IID splits add value when only public flow features exist (no device-level topology).</w:t>
+      </w:r>
+    </w:p>
+    <w:p>
+      <w:r>
+        <w:t>A dynamic GNN (GAT + GRU over kNN flow graphs) is trained with Flower FedAvg (three clients); Captum attributions and attention cues feed ECS-like alerts from FastAPI. Chapter 8 reports 100% test F1 and ROC-AUC for centralised and federated GNN on the fixed subset, fewer false alarms than Random Forest on the same split, about 22.7 ms CPU inference per sequence, about 31 MB federated messaging over ten rounds, plus ablation, sensitivity, and multi-seed checks. Scope is a 45-day MSc build; limitations and future work are in Chapter 9.</w:t>
       </w:r>
     </w:p>
     <w:p>
@@ -127,11 +137,29 @@
         <w:pStyle w:val="Heading1"/>
       </w:pPr>
       <w:r>
+        <w:t>Acknowledgements</w:t>
+      </w:r>
+    </w:p>
+    <w:p>
+      <w:r>
+        <w:t>I thank my supervisor, Dr. Raja Ujjan, for technical guidance, feedback on design and evaluation, and support throughout the project. I thank my moderator, Muhsin Hassanu, for reviewing interim work and helping sharpen the final report. I am grateful to School and programme staff for module materials and submission guidance, and to the MSc Project co-ordinator for administrative communication around milestones and ethics. Finally, I thank friends and family for patience during intensive writing and experiment runs.</w:t>
+      </w:r>
+    </w:p>
+    <w:p>
+      <w:pPr>
+        <w:pStyle w:val="Heading1"/>
+      </w:pPr>
+      <w:r>
         <w:t>Table of Contents</w:t>
       </w:r>
     </w:p>
     <w:p>
       <w:r>
+        <w:t>Acknowledgements</w:t>
+      </w:r>
+    </w:p>
+    <w:p>
+      <w:r>
         <w:t xml:space="preserve">Chapter 1 – Introduction  </w:t>
       </w:r>
     </w:p>
@@ -192,7 +220,7 @@
     </w:p>
     <w:p>
       <w:r>
-        <w:t>Chapter 13 – Appendices (A: Process Documents; B: Project Specification; C: Reproducibility)</w:t>
+        <w:t>Chapter 13 – Appendices (A: process; B: specification; C: reproducibility; D: handbook App. 1 code figures; E: handbook App. 4 optional; mapping table + Word export note inside)</w:t>
       </w:r>
     </w:p>
     <w:p>
@@ -757,6 +785,198 @@
           </w:p>
         </w:tc>
       </w:tr>
+      <w:tr>
+        <w:tc>
+          <w:tcPr>
+            <w:tcW w:type="dxa" w:w="2880"/>
+          </w:tcPr>
+          <w:p>
+            <w:r>
+              <w:t>17</w:t>
+            </w:r>
+          </w:p>
+        </w:tc>
+        <w:tc>
+          <w:tcPr>
+            <w:tcW w:type="dxa" w:w="2880"/>
+          </w:tcPr>
+          <w:p>
+            <w:r>
+              <w:t>Appendix 1 — Figure A1-1: `DynamicGNN` class (GAT + GRU / ablation path)</w:t>
+            </w:r>
+          </w:p>
+        </w:tc>
+        <w:tc>
+          <w:tcPr>
+            <w:tcW w:type="dxa" w:w="2880"/>
+          </w:tcPr>
+          <w:p>
+            <w:r>
+              <w:t>—</w:t>
+            </w:r>
+          </w:p>
+        </w:tc>
+      </w:tr>
+      <w:tr>
+        <w:tc>
+          <w:tcPr>
+            <w:tcW w:type="dxa" w:w="2880"/>
+          </w:tcPr>
+          <w:p>
+            <w:r>
+              <w:t>18</w:t>
+            </w:r>
+          </w:p>
+        </w:tc>
+        <w:tc>
+          <w:tcPr>
+            <w:tcW w:type="dxa" w:w="2880"/>
+          </w:tcPr>
+          <w:p>
+            <w:r>
+              <w:t>Appendix 1 — Figure A1-2: `flows_to_knn_graph` — building one *k*NN window graph</w:t>
+            </w:r>
+          </w:p>
+        </w:tc>
+        <w:tc>
+          <w:tcPr>
+            <w:tcW w:type="dxa" w:w="2880"/>
+          </w:tcPr>
+          <w:p>
+            <w:r>
+              <w:t>—</w:t>
+            </w:r>
+          </w:p>
+        </w:tc>
+      </w:tr>
+      <w:tr>
+        <w:tc>
+          <w:tcPr>
+            <w:tcW w:type="dxa" w:w="2880"/>
+          </w:tcPr>
+          <w:p>
+            <w:r>
+              <w:t>19</w:t>
+            </w:r>
+          </w:p>
+        </w:tc>
+        <w:tc>
+          <w:tcPr>
+            <w:tcW w:type="dxa" w:w="2880"/>
+          </w:tcPr>
+          <w:p>
+            <w:r>
+              <w:t>Appendix 1 — Figure A1-3: Stratified windowing — `build_graphs_for_split`</w:t>
+            </w:r>
+          </w:p>
+        </w:tc>
+        <w:tc>
+          <w:tcPr>
+            <w:tcW w:type="dxa" w:w="2880"/>
+          </w:tcPr>
+          <w:p>
+            <w:r>
+              <w:t>—</w:t>
+            </w:r>
+          </w:p>
+        </w:tc>
+      </w:tr>
+      <w:tr>
+        <w:tc>
+          <w:tcPr>
+            <w:tcW w:type="dxa" w:w="2880"/>
+          </w:tcPr>
+          <w:p>
+            <w:r>
+              <w:t>20</w:t>
+            </w:r>
+          </w:p>
+        </w:tc>
+        <w:tc>
+          <w:tcPr>
+            <w:tcW w:type="dxa" w:w="2880"/>
+          </w:tcPr>
+          <w:p>
+            <w:r>
+              <w:t>Appendix 1 — Figure A1-4: `explain_sequence` — Integrated Gradients and top-*k* ranking</w:t>
+            </w:r>
+          </w:p>
+        </w:tc>
+        <w:tc>
+          <w:tcPr>
+            <w:tcW w:type="dxa" w:w="2880"/>
+          </w:tcPr>
+          <w:p>
+            <w:r>
+              <w:t>—</w:t>
+            </w:r>
+          </w:p>
+        </w:tc>
+      </w:tr>
+      <w:tr>
+        <w:tc>
+          <w:tcPr>
+            <w:tcW w:type="dxa" w:w="2880"/>
+          </w:tcPr>
+          <w:p>
+            <w:r>
+              <w:t>21</w:t>
+            </w:r>
+          </w:p>
+        </w:tc>
+        <w:tc>
+          <w:tcPr>
+            <w:tcW w:type="dxa" w:w="2880"/>
+          </w:tcPr>
+          <w:p>
+            <w:r>
+              <w:t>Appendix 1 — Figure A1-5: Flower federated client entry — `run_federated.py`</w:t>
+            </w:r>
+          </w:p>
+        </w:tc>
+        <w:tc>
+          <w:tcPr>
+            <w:tcW w:type="dxa" w:w="2880"/>
+          </w:tcPr>
+          <w:p>
+            <w:r>
+              <w:t>—</w:t>
+            </w:r>
+          </w:p>
+        </w:tc>
+      </w:tr>
+      <w:tr>
+        <w:tc>
+          <w:tcPr>
+            <w:tcW w:type="dxa" w:w="2880"/>
+          </w:tcPr>
+          <w:p>
+            <w:r>
+              <w:t>22</w:t>
+            </w:r>
+          </w:p>
+        </w:tc>
+        <w:tc>
+          <w:tcPr>
+            <w:tcW w:type="dxa" w:w="2880"/>
+          </w:tcPr>
+          <w:p>
+            <w:r>
+              <w:t>Appendix 1 — Figure A1-6: FastAPI `/score` — inference, explanation, ECS-style alert</w:t>
+            </w:r>
+          </w:p>
+        </w:tc>
+        <w:tc>
+          <w:tcPr>
+            <w:tcW w:type="dxa" w:w="2880"/>
+          </w:tcPr>
+          <w:p>
+            <w:r>
+              <w:t>—</w:t>
+            </w:r>
+          </w:p>
+        </w:tc>
+      </w:tr>
     </w:tbl>
     <w:p>
       <w:pPr>
@@ -1163,7 +1383,7 @@
     </w:p>
     <w:p>
       <w:r>
-        <w:t>The rest of the dissertation follows a UWS-style chapter layout (similar to the School’s exemplar reports). Chapter 2 reviews literature. Chapter 3 covers project management and risks. Chapter 4 sets out research design and methodology. Chapter 5 presents system and graph design (including the pipeline figure). Chapter 6 documents implementation. Chapter 7 describes testing and evaluation protocol and metrics. Chapter 8 presents results objectively. Chapter 9 combines discussion, conclusions, and recommendations to meet the combined interpretation and closing weighting in the assessment grid. Chapter 10 is critical self-evaluation. Chapters 11–12 are references and bibliography. Chapter 13 lists appendices.</w:t>
+        <w:t>The rest of the dissertation follows a UWS-style chapter layout (similar to the School’s exemplar reports). Chapter 2 reviews literature. Chapter 3 covers project management and risks. Chapter 4 sets out research design and methodology. Chapter 5 presents system and graph design (including the pipeline figure). Chapter 6 documents implementation. Chapter 7 describes testing and evaluation protocol and metrics. Chapter 8 presents results objectively. Chapter 9 combines discussion, conclusions, and recommendations to meet the combined interpretation and closing weighting in the assessment grid. Chapter 10 is critical self-evaluation. Chapters 11–12 are references and bibliography. Chapter 13 lists appendices (process, specification, reproducibility, Handbook Appendix 1 code figures with captions and interpretations, and optional repository or demonstration).</w:t>
       </w:r>
     </w:p>
     <w:p>
@@ -2677,6 +2897,11 @@
     </w:tbl>
     <w:p>
       <w:r>
+        <w:t>Source: Author compilation from the papers cited in Chapter 11; table is descriptive only.</w:t>
+      </w:r>
+    </w:p>
+    <w:p>
+      <w:r>
         <w:t>Figure 10: Positioning of related work — GNN, federated learning, explainability, and SIEM-style alerts</w:t>
       </w:r>
     </w:p>
@@ -2747,7 +2972,20 @@
         <w:pStyle w:val="Heading2"/>
       </w:pPr>
       <w:r>
-        <w:t>2.9 Chapter summary</w:t>
+        <w:t>2.9 Mapping to CyBOK (Cyber Security Body of Knowledge)</w:t>
+      </w:r>
+    </w:p>
+    <w:p>
+      <w:r>
+        <w:t>The agreed project specification (Appendix B) records this work against CyBOK knowledge areas. The dissertation aligns with the following topics in particular: Attacks &amp; Defences → Security Operations &amp; Incident Management (SIEM-style alerting, SOC triage, and intrusion detection outputs); Infrastructure Security → Network Security (flow-based analysis and IoT traffic classification); Systems Security → Distributed Systems Security (federated learning without centralising raw client data); and Software and Platform Security → Software Security (engineering of the prototype pipeline, APIs, and reproducible scripts). Together, these areas situate the project within the School’s CyBOK mapping and match the specification’s indicative coverage.</w:t>
+      </w:r>
+    </w:p>
+    <w:p>
+      <w:pPr>
+        <w:pStyle w:val="Heading2"/>
+      </w:pPr>
+      <w:r>
+        <w:t>2.10 Chapter summary</w:t>
       </w:r>
     </w:p>
     <w:p>
@@ -3287,6 +3525,11 @@
       </w:r>
     </w:p>
     <w:p>
+      <w:r>
+        <w:t>Source: Author’s own diagram; reflects the implementation and data path described in Chapters 5–6 and Appendix C.</w:t>
+      </w:r>
+    </w:p>
+    <w:p>
       <w:pPr>
         <w:pStyle w:val="Heading2"/>
       </w:pPr>
@@ -4009,6 +4252,11 @@
         </w:tc>
       </w:tr>
     </w:tbl>
+    <w:p>
+      <w:r>
+        <w:t>Source: Author-derived metrics on the fixed CICIoT2023 subset (Pinto et al., 2023); results/metrics/results_table.csv; reproducibility in Chapter 13.</w:t>
+      </w:r>
+    </w:p>
     <w:p>
       <w:r>
         <w:t>Figure 2: Confusion matrix for Dynamic GNN on test set</w:t>
@@ -4060,6 +4308,11 @@
     </w:p>
     <w:p>
       <w:r>
+        <w:t>Source: Author’s own plot from test-set predictions; data CICIoT2023 (Pinto et al., 2023); scripts/run_all.py.</w:t>
+      </w:r>
+    </w:p>
+    <w:p>
+      <w:r>
         <w:t>Figure 3: ROC curve for Dynamic GNN on test set</w:t>
       </w:r>
     </w:p>
@@ -4109,6 +4362,11 @@
     </w:p>
     <w:p>
       <w:r>
+        <w:t>Source: Author’s own plot from test-set scores; data CICIoT2023 (Pinto et al., 2023); scripts/run_all.py.</w:t>
+      </w:r>
+    </w:p>
+    <w:p>
+      <w:r>
         <w:t>Figure 6: Confusion matrix for Random Forest on test set</w:t>
       </w:r>
     </w:p>
@@ -4158,6 +4416,11 @@
     </w:p>
     <w:p>
       <w:r>
+        <w:t>Source: Author’s own plot; baseline from scripts/run_all.py; data CICIoT2023 (Pinto et al., 2023).</w:t>
+      </w:r>
+    </w:p>
+    <w:p>
+      <w:r>
         <w:t>Figure 7: Confusion matrix for MLP on test set</w:t>
       </w:r>
     </w:p>
@@ -4207,6 +4470,11 @@
     </w:p>
     <w:p>
       <w:r>
+        <w:t>Source: Author’s own plot; baseline from scripts/run_all.py; data CICIoT2023 (Pinto et al., 2023).</w:t>
+      </w:r>
+    </w:p>
+    <w:p>
+      <w:r>
         <w:t>Figure 8: ROC curve for Random Forest on test set</w:t>
       </w:r>
     </w:p>
@@ -4256,6 +4524,11 @@
     </w:p>
     <w:p>
       <w:r>
+        <w:t>Source: Author’s own plot; baseline from scripts/run_all.py; data CICIoT2023 (Pinto et al., 2023).</w:t>
+      </w:r>
+    </w:p>
+    <w:p>
+      <w:r>
         <w:t>Figure 9: ROC curve for MLP on test set</w:t>
       </w:r>
     </w:p>
@@ -4305,6 +4578,11 @@
     </w:p>
     <w:p>
       <w:r>
+        <w:t>Source: Author’s own plot; baseline from scripts/run_all.py; data CICIoT2023 (Pinto et al., 2023).</w:t>
+      </w:r>
+    </w:p>
+    <w:p>
+      <w:r>
         <w:t>The confusion matrices (Figures 2, 6, 7) report TP, TN, FP, and FN counts per model. Figure 2 shows zero FP and zero FN for the GNN on this test set. Figures 6 and 7 show 187 FP for Random Forest and 4 FP for MLP (benign predicted as attack). The ROC curves (Figures 3, 8, 9) plot TPR vs. FPR across thresholds; reported ROC-AUC values are in Table 1. Implications for SOC triage and model choice are discussed in Chapter 9.</w:t>
       </w:r>
     </w:p>
@@ -4916,6 +5194,11 @@
         </w:tc>
       </w:tr>
     </w:tbl>
+    <w:p>
+      <w:r>
+        <w:t>Source: Author-derived round metrics; Flower FedAvg run; results/metrics/ (see Chapter 13).</w:t>
+      </w:r>
+    </w:p>
     <w:p>
       <w:r>
         <w:t>Figure 4: Federated learning convergence (F1 and ROC-AUC vs. round)</w:t>
@@ -4966,6 +5249,11 @@
       </w:r>
     </w:p>
     <w:p>
+      <w:r>
+        <w:t>Source: Author’s own plot; scripts/generate_alerts_and_plots.py / federated training logs; data CICIoT2023 (Pinto et al., 2023).</w:t>
+      </w:r>
+    </w:p>
+    <w:p>
       <w:pPr>
         <w:pStyle w:val="Heading2"/>
       </w:pPr>
@@ -5289,6 +5577,11 @@
         </w:tc>
       </w:tr>
     </w:tbl>
+    <w:p>
+      <w:r>
+        <w:t>Source: results/metrics/gnn_training_history.json; central GNN training run (scripts/run_all.py).</w:t>
+      </w:r>
+    </w:p>
     <w:p>
       <w:pPr>
         <w:pStyle w:val="Heading2"/>
@@ -5352,6 +5645,11 @@
       </w:r>
     </w:p>
     <w:p>
+      <w:r>
+        <w:t>Source: Author’s own plot; metrics from Table 1 and inference timings in results/metrics/; scripts/generate_alerts_and_plots.py.</w:t>
+      </w:r>
+    </w:p>
+    <w:p>
       <w:pPr>
         <w:pStyle w:val="Heading2"/>
       </w:pPr>
@@ -5612,6 +5910,11 @@
         </w:tc>
       </w:tr>
     </w:tbl>
+    <w:p>
+      <w:r>
+        <w:t>Source: results/metrics/ablation_table.csv; scripts/run_ablation.py; test split CICIoT2023 (Pinto et al., 2023).</w:t>
+      </w:r>
+    </w:p>
     <w:p>
       <w:r>
         <w:t>Numeric summary: full (GAT + GRU) — precision 1.0000, F1 1.0000, ROC-AUC 1.0000, inference 22.70 ms; GAT-only (mean pool over windows) — precision 0.9923, F1 0.9961, ROC-AUC 1.0000, inference 16.06 ms.</w:t>
@@ -5668,7 +5971,12 @@
     </w:p>
     <w:p>
       <w:r>
-        <w:t>Interpretation of the temporal (GRU) vs. pooling trade-off is in §9.2 and §9.4.</w:t>
+        <w:t>Source: Author’s own plot; results/metrics/ablation_table.csv; scripts/run_ablation.py.</w:t>
+      </w:r>
+    </w:p>
+    <w:p>
+      <w:r>
+        <w:t>Interpretation of the temporal (GRU) vs. pooling trade-off is in §9.3 and §9.5.</w:t>
       </w:r>
     </w:p>
     <w:p>
@@ -6426,12 +6734,17 @@
     </w:tbl>
     <w:p>
       <w:r>
-        <w:t>Grid interpretation is in §9.2.</w:t>
-      </w:r>
-    </w:p>
-    <w:p>
-      <w:r>
-        <w:t>Figure 15: Sensitivity of test F1 and ROC-AUC to window size and kNN k.</w:t>
+        <w:t>Source: results/metrics/sensitivity_table.csv; scripts/run_sensitivity_and_seeds.py; test split CICIoT2023 (Pinto et al., 2023).</w:t>
+      </w:r>
+    </w:p>
+    <w:p>
+      <w:r>
+        <w:t>Grid interpretation is in §9.3.</w:t>
+      </w:r>
+    </w:p>
+    <w:p>
+      <w:r>
+        <w:t>*Figure 15: Sensitivity of test F1 and ROC-AUC to window size and kNN k***</w:t>
       </w:r>
     </w:p>
     <w:p>
@@ -6479,6 +6792,11 @@
       </w:r>
     </w:p>
     <w:p>
+      <w:r>
+        <w:t>Source: Author’s own plot; results/metrics/sensitivity_table.csv; scripts/run_sensitivity_and_seeds.py.</w:t>
+      </w:r>
+    </w:p>
+    <w:p>
       <w:pPr>
         <w:pStyle w:val="Heading2"/>
       </w:pPr>
@@ -6884,6 +7202,11 @@
     </w:tbl>
     <w:p>
       <w:r>
+        <w:t>Source: results/metrics/multi_seed_summary.json; scripts/run_sensitivity_and_seeds.py; test split CICIoT2023 (Pinto et al., 2023).</w:t>
+      </w:r>
+    </w:p>
+    <w:p>
+      <w:r>
         <w:t>Table 7 reports mean F1 = ROC-AUC = 1.0 and zero standard deviation on this test split for all three seeds. Per-seed inference times in the raw logs vary with CPU timing; the headline ~22.7 ms deployment figure is from the primary seed 42 run (Table 1). What this implies for generalisation is discussed in Chapter 9.</w:t>
       </w:r>
     </w:p>
@@ -6918,7 +7241,7 @@
     </w:p>
     <w:p>
       <w:r>
-        <w:t>This chapter answers the research questions, discusses strengths and limits, relates findings to the literature, summarises achievements, and lists future work—equivalent to the exemplar dissertation’s separation between “Results” and “Conclusion” but combined here to match the programme’s percentage allocation for conclusions and interpretive discussion.</w:t>
+        <w:t>This chapter answers the research questions, discusses strengths and limits, relates findings to the literature, summarises achievements, and lists future work—equivalent to the exemplar dissertation’s separation between “Results” and “Conclusion” but combined here to match the programme’s percentage allocation for conclusions and interpretive discussion. §9.2 gives a four-paragraph programme-style conclusion (field → contribution → limits → outlook); §9.3–§9.9 retain the detailed discussion structure used throughout the draft.</w:t>
       </w:r>
     </w:p>
     <w:p>
@@ -6926,7 +7249,35 @@
         <w:pStyle w:val="Heading2"/>
       </w:pPr>
       <w:r>
-        <w:t>9.2 Answering the Research Questions</w:t>
+        <w:t>9.2 Structured conclusion (programme format)</w:t>
+      </w:r>
+    </w:p>
+    <w:p>
+      <w:r>
+        <w:t>This dissertation addressed SOC-oriented, CPU-edge intrusion detection for Software-Defined IoT flow telemetry, where analysts need accurate models, privacy-preserving training where raw flows cannot be pooled, and explainable outputs that fit SIEM-style workflows. The work situates that need in CICIoT2023 and in prior literature that often treats GNNs, federated learning, and XAI separately rather than as one deployable path.</w:t>
+      </w:r>
+    </w:p>
+    <w:p>
+      <w:r>
+        <w:t>The main outcome is an end-to-end prototype: kNN feature-similarity graphs over windowed flows, a dynamic GNN (GAT + GRU), Flower FedAvg with three clients, Captum attributions and attention cues folded into ECS-like JSON via FastAPI. On the fixed subset and splits documented in Chapters 7–8, the central and federated GNN matched strong RF and MLP baselines on headline accuracy while reporting fewer false alarms on the test split, sub-23 ms CPU inference per sequence, modest federated communication over ten rounds, and supporting ablation, sensitivity, and multi-seed evidence.</w:t>
+      </w:r>
+    </w:p>
+    <w:p>
+      <w:r>
+        <w:t>Limitations are substantial and explicit: a 45-day MSc scope, a subset of a lab dataset, no device-level graph where the public release lacks identifiers, small federated topology, no formal SOC user study, and headline 100% metrics that must be read as subset-specific rather than universal—mitigated by split hygiene checks, baseline parity, and robustness tables, not dismissed.</w:t>
+      </w:r>
+    </w:p>
+    <w:p>
+      <w:r>
+        <w:t>Outlook: scaling data and clients, live-traffic validation, analyst-facing evaluation, tighter SIEM integration, and publication-oriented breakdowns (per attack type, stronger heterogeneity) are the natural next steps; they are expanded in §9.8. Together, the chapters show that the research questions are answered for a documented prototype, with honest limits and a clear path beyond the thesis.</w:t>
+      </w:r>
+    </w:p>
+    <w:p>
+      <w:pPr>
+        <w:pStyle w:val="Heading2"/>
+      </w:pPr>
+      <w:r>
+        <w:t>9.3 Answering the Research Questions</w:t>
       </w:r>
     </w:p>
     <w:p>
@@ -6969,7 +7320,7 @@
         <w:pStyle w:val="Heading2"/>
       </w:pPr>
       <w:r>
-        <w:t>9.3 Strengths and Limitations</w:t>
+        <w:t>9.4 Strengths and Limitations</w:t>
       </w:r>
     </w:p>
     <w:p>
@@ -6987,7 +7338,7 @@
         <w:pStyle w:val="Heading2"/>
       </w:pPr>
       <w:r>
-        <w:t>9.4 Practical Implications</w:t>
+        <w:t>9.5 Practical Implications</w:t>
       </w:r>
     </w:p>
     <w:p>
@@ -7005,7 +7356,7 @@
         <w:pStyle w:val="Heading2"/>
       </w:pPr>
       <w:r>
-        <w:t>9.5 Relation to Literature</w:t>
+        <w:t>9.6 Relation to Literature</w:t>
       </w:r>
     </w:p>
     <w:p>
@@ -7023,7 +7374,7 @@
         <w:pStyle w:val="Heading2"/>
       </w:pPr>
       <w:r>
-        <w:t>9.6 Summary of the Project</w:t>
+        <w:t>9.7 Summary of the Project</w:t>
       </w:r>
     </w:p>
     <w:p>
@@ -7041,7 +7392,7 @@
         <w:pStyle w:val="Heading2"/>
       </w:pPr>
       <w:r>
-        <w:t>9.7 Recommendations for Future Work</w:t>
+        <w:t>9.8 Recommendations for Future Work</w:t>
       </w:r>
     </w:p>
     <w:p>
@@ -7084,7 +7435,7 @@
         <w:pStyle w:val="Heading2"/>
       </w:pPr>
       <w:r>
-        <w:t>9.8 Chapter summary</w:t>
+        <w:t>9.9 Chapter summary</w:t>
       </w:r>
     </w:p>
     <w:p>
@@ -7370,7 +7721,177 @@
     </w:p>
     <w:p>
       <w:r>
-        <w:t>For submission: embed or attach the following documents in the final Word/PDF. They are required by the MSc Project Handbook.</w:t>
+        <w:t>For submission: embed or attach the following documents in the final Word/PDF. They are required by the MSc Project Handbook and the School’s dissertation guideline.</w:t>
+      </w:r>
+    </w:p>
+    <w:p>
+      <w:r>
+        <w:t>Handbook numbering vs. this document. Programme materials often use Appendix 1–4. This thesis uses Appendix A–E in the technical body, then separate embedded headings in the automated Word export so letters are not duplicated.</w:t>
+      </w:r>
+    </w:p>
+    <w:tbl>
+      <w:tblPr>
+        <w:tblW w:type="auto" w:w="0"/>
+        <w:tblLook w:firstColumn="1" w:firstRow="1" w:lastColumn="0" w:lastRow="0" w:noHBand="0" w:noVBand="1" w:val="04A0"/>
+      </w:tblPr>
+      <w:tblGrid>
+        <w:gridCol w:w="2880"/>
+        <w:gridCol w:w="2880"/>
+        <w:gridCol w:w="2880"/>
+      </w:tblGrid>
+      <w:tr>
+        <w:tc>
+          <w:tcPr>
+            <w:tcW w:type="dxa" w:w="2880"/>
+          </w:tcPr>
+          <w:p>
+            <w:r>
+              <w:t>Handbook appendix</w:t>
+            </w:r>
+          </w:p>
+        </w:tc>
+        <w:tc>
+          <w:tcPr>
+            <w:tcW w:type="dxa" w:w="2880"/>
+          </w:tcPr>
+          <w:p>
+            <w:r>
+              <w:t>Role</w:t>
+            </w:r>
+          </w:p>
+        </w:tc>
+        <w:tc>
+          <w:tcPr>
+            <w:tcW w:type="dxa" w:w="2880"/>
+          </w:tcPr>
+          <w:p>
+            <w:r>
+              <w:t>Where it appears in this dissertation</w:t>
+            </w:r>
+          </w:p>
+        </w:tc>
+      </w:tr>
+      <w:tr>
+        <w:tc>
+          <w:tcPr>
+            <w:tcW w:type="dxa" w:w="2880"/>
+          </w:tcPr>
+          <w:p>
+            <w:r>
+              <w:t>**Appendix 1** — code screenshots (figures + captions + interpretation)</w:t>
+            </w:r>
+          </w:p>
+        </w:tc>
+        <w:tc>
+          <w:tcPr>
+            <w:tcW w:type="dxa" w:w="2880"/>
+          </w:tcPr>
+          <w:p>
+            <w:r>
+              <w:t>**Appendix D** below; figures **A1-1**–**A1-6**; PNGs under `results/figures/appendix1/` (`scripts/render_appendix1_code_figures.py`)</w:t>
+            </w:r>
+          </w:p>
+        </w:tc>
+        <w:tc>
+          <w:tcPr>
+            <w:tcW w:type="dxa" w:w="2880"/>
+          </w:tcPr>
+          <w:p/>
+        </w:tc>
+      </w:tr>
+      <w:tr>
+        <w:tc>
+          <w:tcPr>
+            <w:tcW w:type="dxa" w:w="2880"/>
+          </w:tcPr>
+          <w:p>
+            <w:r>
+              <w:t>**Appendix 2** — signed project specification</w:t>
+            </w:r>
+          </w:p>
+        </w:tc>
+        <w:tc>
+          <w:tcPr>
+            <w:tcW w:type="dxa" w:w="2880"/>
+          </w:tcPr>
+          <w:p>
+            <w:r>
+              <w:t>**Appendix B** (file pointer); **Full text — Agreed project specification (embedded)** at end of Word export</w:t>
+            </w:r>
+          </w:p>
+        </w:tc>
+        <w:tc>
+          <w:tcPr>
+            <w:tcW w:type="dxa" w:w="2880"/>
+          </w:tcPr>
+          <w:p/>
+        </w:tc>
+      </w:tr>
+      <w:tr>
+        <w:tc>
+          <w:tcPr>
+            <w:tcW w:type="dxa" w:w="2880"/>
+          </w:tcPr>
+          <w:p>
+            <w:r>
+              <w:t>**Appendix 3** — process documentation (and attendance where required)</w:t>
+            </w:r>
+          </w:p>
+        </w:tc>
+        <w:tc>
+          <w:tcPr>
+            <w:tcW w:type="dxa" w:w="2880"/>
+          </w:tcPr>
+          <w:p>
+            <w:r>
+              <w:t>**Appendix A** (file pointers); **Full text — … (embedded)** sections at end of Word export</w:t>
+            </w:r>
+          </w:p>
+        </w:tc>
+        <w:tc>
+          <w:tcPr>
+            <w:tcW w:type="dxa" w:w="2880"/>
+          </w:tcPr>
+          <w:p/>
+        </w:tc>
+      </w:tr>
+      <w:tr>
+        <w:tc>
+          <w:tcPr>
+            <w:tcW w:type="dxa" w:w="2880"/>
+          </w:tcPr>
+          <w:p>
+            <w:r>
+              <w:t>**Appendix 4** (optional) — GitHub / dataset / demo video</w:t>
+            </w:r>
+          </w:p>
+        </w:tc>
+        <w:tc>
+          <w:tcPr>
+            <w:tcW w:type="dxa" w:w="2880"/>
+          </w:tcPr>
+          <w:p>
+            <w:r>
+              <w:t>**Appendix E**</w:t>
+            </w:r>
+          </w:p>
+        </w:tc>
+        <w:tc>
+          <w:tcPr>
+            <w:tcW w:type="dxa" w:w="2880"/>
+          </w:tcPr>
+          <w:p/>
+        </w:tc>
+      </w:tr>
+    </w:tbl>
+    <w:p>
+      <w:r>
+        <w:t>Appendix C is not a handbook “Appendix 1–4” slot: it is reproducibility (environment and commands) so examiners can re-run experiments from Appendix E.1’s repository.</w:t>
+      </w:r>
+    </w:p>
+    <w:p>
+      <w:r>
+        <w:t>Word export note. scripts/dissertation_to_docx.py appends the process documentation, attendance log, and specification after the Markdown body (after Appendix E) under the headings Full text — … so those headings do not clash with Appendix A–E already printed above. If your School template requires a single combined PDF order (e.g. process before code figures), reorder sections once in Word.</w:t>
       </w:r>
     </w:p>
     <w:p>
@@ -7383,6 +7904,11 @@
     </w:p>
     <w:p>
       <w:r>
+        <w:t>In the automated Word export, the full .docx files named below are also inserted after Appendix E under Full text — … headings (see Chapter 13 opening note) so assessors receive both the manifest and the originals.</w:t>
+      </w:r>
+    </w:p>
+    <w:p>
+      <w:r>
         <w:t xml:space="preserve">- Project Process Documentation — Arka_Talukder_Process_Documentation_B01821011.docx  </w:t>
       </w:r>
     </w:p>
@@ -7411,6 +7937,11 @@
     </w:p>
     <w:p>
       <w:r>
+        <w:t>The signed specification .docx is also embedded after Appendix E in the Word export (Full text — Agreed project specification).</w:t>
+      </w:r>
+    </w:p>
+    <w:p>
+      <w:r>
         <w:t xml:space="preserve">- Agreed Project Specification — Arka-B01821011_MSc Cyber Security Project specification_form_2025-26.docx  </w:t>
       </w:r>
     </w:p>
@@ -7429,6 +7960,11 @@
     </w:p>
     <w:p>
       <w:r>
+        <w:t>This appendix gives commands and paths to reproduce the quantitative results and figures in Chapters 7–8 from the codebase. It is separate from the handbook’s optional Appendix 4 (repository / video), which is provided in Appendix E. Clone or download the project from Appendix E.1, obtain CICIoT2023 per Appendix E.2, then run the steps below.</w:t>
+      </w:r>
+    </w:p>
+    <w:p>
+      <w:r>
         <w:t>To reproduce the experiments and results reported in this dissertation:</w:t>
       </w:r>
     </w:p>
@@ -7568,6 +8104,435 @@
       </w:r>
     </w:p>
     <w:p>
+      <w:pPr>
+        <w:pStyle w:val="Heading2"/>
+      </w:pPr>
+      <w:r>
+        <w:t>Appendix D: Handbook Appendix 1 — Screenshots of project code</w:t>
+      </w:r>
+    </w:p>
+    <w:p>
+      <w:r>
+        <w:t>The handbook requires Appendix 1 code views to be presented as figures, each with a caption and an explanation of how to interpret the code in the context of this dissertation. Below, Figure A1-1–Figure A1-6 satisfy that requirement.</w:t>
+      </w:r>
+    </w:p>
+    <w:p>
+      <w:r>
+        <w:t>The bitmaps are generated automatically from the submission codebase so line numbers stay aligned with the files on disk. Regenerate them after editing source with:</w:t>
+      </w:r>
+    </w:p>
+    <w:p>
+      <w:r>
+        <w:t>python scripts/render_appendix1_code_figures.py</w:t>
+      </w:r>
+    </w:p>
+    <w:p>
+      <w:r>
+        <w:t>Output directory: results/figures/appendix1/. For the Word build, figures 17–22 in the Table of Figures correspond to A1-1–A1-6. End-to-end batch orchestration (preprocess → graphs → baselines → GNN → plots) lives in scripts/run_all.py and is documented in Appendix C; it is not duplicated as a separate figure here to avoid overlap with Figure A1-1 and the pipeline description in Chapter 6.</w:t>
+      </w:r>
+    </w:p>
+    <w:p>
+      <w:r>
+        <w:drawing>
+          <wp:inline xmlns:a="http://schemas.openxmlformats.org/drawingml/2006/main" xmlns:pic="http://schemas.openxmlformats.org/drawingml/2006/picture">
+            <wp:extent cx="5029200" cy="10311574"/>
+            <wp:docPr id="17" name="Picture 17"/>
+            <wp:cNvGraphicFramePr>
+              <a:graphicFrameLocks noChangeAspect="1"/>
+            </wp:cNvGraphicFramePr>
+            <a:graphic>
+              <a:graphicData uri="http://schemas.openxmlformats.org/drawingml/2006/picture">
+                <pic:pic>
+                  <pic:nvPicPr>
+                    <pic:cNvPr id="17" name="fig_a1_01_dynamic_gnn.png"/>
+                    <pic:cNvPicPr/>
+                  </pic:nvPicPr>
+                  <pic:blipFill>
+                    <a:blip r:embed="rId25"/>
+                    <a:stretch>
+                      <a:fillRect/>
+                    </a:stretch>
+                  </pic:blipFill>
+                  <pic:spPr>
+                    <a:xfrm>
+                      <a:off x="0" y="0"/>
+                      <a:ext cx="5029200" cy="10311574"/>
+                    </a:xfrm>
+                    <a:prstGeom prst="rect"/>
+                  </pic:spPr>
+                </pic:pic>
+              </a:graphicData>
+            </a:graphic>
+          </wp:inline>
+        </w:drawing>
+      </w:r>
+    </w:p>
+    <w:p>
+      <w:pPr>
+        <w:pStyle w:val="Caption"/>
+      </w:pPr>
+      <w:r>
+        <w:t>Figure A1-1 — Dynamic graph classifier: `DynamicGNN` (GAT layers, pooling, GRU vs. mean-pool ablation, logits). Source: `src/models/dynamic_gnn.py`, lines 12–97.</w:t>
+      </w:r>
+    </w:p>
+    <w:p>
+      <w:r>
+        <w:t>Caption (formal): Figure A1-1 — Core implementation of the dynamic GNN (DynamicGNN): node embedding, two GATConv layers with multi-head attention and dropout, per-window graph embedding, sequence encoding with GRU (or mean-pool when use_gru is false for ablation), and two-class logits. Attention weights may be retained for explainability (return_attention_weights).</w:t>
+      </w:r>
+    </w:p>
+    <w:p>
+      <w:r>
+        <w:t>How to interpret: This class is the main learnable model described in Chapters 5–6. Each time step is one PyTorch Geometric Data object (nodes = flows in a window, edges = kNN). _encode_graph applies GAT message passing and reduces node states to one vector per window; forward stacks windows in time order and either runs the GRU (full model) or mean-pools over time (ablation in §8.7). The from_config constructor ties hyperparameters to config/experiment.yaml, which supports the sensitivity study in §8.8.</w:t>
+      </w:r>
+    </w:p>
+    <w:p>
+      <w:r>
+        <w:drawing>
+          <wp:inline xmlns:a="http://schemas.openxmlformats.org/drawingml/2006/main" xmlns:pic="http://schemas.openxmlformats.org/drawingml/2006/picture">
+            <wp:extent cx="5029200" cy="4398902"/>
+            <wp:docPr id="18" name="Picture 18"/>
+            <wp:cNvGraphicFramePr>
+              <a:graphicFrameLocks noChangeAspect="1"/>
+            </wp:cNvGraphicFramePr>
+            <a:graphic>
+              <a:graphicData uri="http://schemas.openxmlformats.org/drawingml/2006/picture">
+                <pic:pic>
+                  <pic:nvPicPr>
+                    <pic:cNvPr id="18" name="fig_a1_02_graph_builder_knn_graph.png"/>
+                    <pic:cNvPicPr/>
+                  </pic:nvPicPr>
+                  <pic:blipFill>
+                    <a:blip r:embed="rId26"/>
+                    <a:stretch>
+                      <a:fillRect/>
+                    </a:stretch>
+                  </pic:blipFill>
+                  <pic:spPr>
+                    <a:xfrm>
+                      <a:off x="0" y="0"/>
+                      <a:ext cx="5029200" cy="4398902"/>
+                    </a:xfrm>
+                    <a:prstGeom prst="rect"/>
+                  </pic:spPr>
+                </pic:pic>
+              </a:graphicData>
+            </a:graphic>
+          </wp:inline>
+        </w:drawing>
+      </w:r>
+    </w:p>
+    <w:p>
+      <w:pPr>
+        <w:pStyle w:val="Caption"/>
+      </w:pPr>
+      <w:r>
+        <w:t>Figure A1-2 — Constructing a single-window *k*NN graph from flow feature rows. Source: `src/data/graph_builder.py`, lines 25–58.</w:t>
+      </w:r>
+    </w:p>
+    <w:p>
+      <w:r>
+        <w:t>Caption (formal): Figure A1-2 — flows_to_knn_graph: for one window of N flows with F features, fits sklearn.neighbors.NearestNeighbors (Euclidean), adds bidirectional edges among each node and its k actual neighbours (capped when N is small), and returns a torch_geometric.data.Data object with x, edge_index, and graph-level label y.</w:t>
+      </w:r>
+    </w:p>
+    <w:p>
+      <w:r>
+        <w:t>How to interpret: This function shows how “graph structure” is defined when device IPs are unavailable (Chapter 1): similarity in the 46-dimensional flow feature space replaces physical topology. Bidirectional edges make the graph undirected for GAT. The label on the graph is supplied by the caller (binary benign vs. attack) and matches the stratified pool in Figure A1-3, not a per-flow vote—important for reading the evaluation chapters.</w:t>
+      </w:r>
+    </w:p>
+    <w:p>
+      <w:r>
+        <w:drawing>
+          <wp:inline xmlns:a="http://schemas.openxmlformats.org/drawingml/2006/main" xmlns:pic="http://schemas.openxmlformats.org/drawingml/2006/picture">
+            <wp:extent cx="5029200" cy="5192708"/>
+            <wp:docPr id="19" name="Picture 19"/>
+            <wp:cNvGraphicFramePr>
+              <a:graphicFrameLocks noChangeAspect="1"/>
+            </wp:cNvGraphicFramePr>
+            <a:graphic>
+              <a:graphicData uri="http://schemas.openxmlformats.org/drawingml/2006/picture">
+                <pic:pic>
+                  <pic:nvPicPr>
+                    <pic:cNvPr id="19" name="fig_a1_03_graph_builder_stratified.png"/>
+                    <pic:cNvPicPr/>
+                  </pic:nvPicPr>
+                  <pic:blipFill>
+                    <a:blip r:embed="rId27"/>
+                    <a:stretch>
+                      <a:fillRect/>
+                    </a:stretch>
+                  </pic:blipFill>
+                  <pic:spPr>
+                    <a:xfrm>
+                      <a:off x="0" y="0"/>
+                      <a:ext cx="5029200" cy="5192708"/>
+                    </a:xfrm>
+                    <a:prstGeom prst="rect"/>
+                  </pic:spPr>
+                </pic:pic>
+              </a:graphicData>
+            </a:graphic>
+          </wp:inline>
+        </w:drawing>
+      </w:r>
+    </w:p>
+    <w:p>
+      <w:pPr>
+        <w:pStyle w:val="Caption"/>
+      </w:pPr>
+      <w:r>
+        <w:t>Figure A1-3 — Stratified windowing so both classes appear in training graphs. Source: `src/data/graph_builder.py`, lines 89–129.</w:t>
+      </w:r>
+    </w:p>
+    <w:p>
+      <w:r>
+        <w:t>Caption (formal): Figure A1-3 — build_graphs_for_split: splits flows into benign and attack pools, builds sliding (or strided) windows from each pool with _build_windows_from_pool, balances counts between classes, shuffles, and logs totals—addressing severe class imbalance in raw CICIoT2023.</w:t>
+      </w:r>
+    </w:p>
+    <w:p>
+      <w:r>
+        <w:t>How to interpret: This block explains why training does not collapse to “always predict attack” despite a very high attack ratio in the raw CSV (Chapter 4): windows are drawn within each class, so each graph’s supervision matches the pool. The minority_stride argument increases overlap for the benign pool when it is smaller. The dissertation’s window size and k used in experiments come from config/experiment.yaml and feed the sensitivity grid in §8.8.</w:t>
+      </w:r>
+    </w:p>
+    <w:p>
+      <w:r>
+        <w:drawing>
+          <wp:inline xmlns:a="http://schemas.openxmlformats.org/drawingml/2006/main" xmlns:pic="http://schemas.openxmlformats.org/drawingml/2006/picture">
+            <wp:extent cx="5029200" cy="6218591"/>
+            <wp:docPr id="20" name="Picture 20"/>
+            <wp:cNvGraphicFramePr>
+              <a:graphicFrameLocks noChangeAspect="1"/>
+            </wp:cNvGraphicFramePr>
+            <a:graphic>
+              <a:graphicData uri="http://schemas.openxmlformats.org/drawingml/2006/picture">
+                <pic:pic>
+                  <pic:nvPicPr>
+                    <pic:cNvPr id="20" name="fig_a1_04_explainer_integrated_gradients.png"/>
+                    <pic:cNvPicPr/>
+                  </pic:nvPicPr>
+                  <pic:blipFill>
+                    <a:blip r:embed="rId28"/>
+                    <a:stretch>
+                      <a:fillRect/>
+                    </a:stretch>
+                  </pic:blipFill>
+                  <pic:spPr>
+                    <a:xfrm>
+                      <a:off x="0" y="0"/>
+                      <a:ext cx="5029200" cy="6218591"/>
+                    </a:xfrm>
+                    <a:prstGeom prst="rect"/>
+                  </pic:spPr>
+                </pic:pic>
+              </a:graphicData>
+            </a:graphic>
+          </wp:inline>
+        </w:drawing>
+      </w:r>
+    </w:p>
+    <w:p>
+      <w:pPr>
+        <w:pStyle w:val="Caption"/>
+      </w:pPr>
+      <w:r>
+        <w:t>Figure A1-4 — Post-hoc explanations: forward pass with attention, Integrated Gradients, top nodes/features. Source: `src/explain/explainer.py`, lines 53–102.</w:t>
+      </w:r>
+    </w:p>
+    <w:p>
+      <w:r>
+        <w:t>Caption (formal): Figure A1-4 — explain_sequence: runs the model with attention enabled, wraps Captum Integrated Gradients on the last window’s node features (_ig_wrapper), aggregates absolute attributions to rank top nodes and top feature indices, and returns an ExplanationBundle for JSON alert formatting.</w:t>
+      </w:r>
+    </w:p>
+    <w:p>
+      <w:r>
+        <w:t>How to interpret: This is the bridge between Chapter 6 (implementation) and Chapter 8 (example alerts): SOC-facing text is not arbitrary—it is derived from IG magnitudes and GAT edge attention from the same forward pass analysts would get at inference. IG is computed on the most recent graph in the sequence (design choice documented in code comments). If Captum is missing, the bundle degrades gracefully (HAS_CAPTUM guard in the same module).</w:t>
+      </w:r>
+    </w:p>
+    <w:p>
+      <w:r>
+        <w:drawing>
+          <wp:inline xmlns:a="http://schemas.openxmlformats.org/drawingml/2006/main" xmlns:pic="http://schemas.openxmlformats.org/drawingml/2006/picture">
+            <wp:extent cx="5029200" cy="5535548"/>
+            <wp:docPr id="21" name="Picture 21"/>
+            <wp:cNvGraphicFramePr>
+              <a:graphicFrameLocks noChangeAspect="1"/>
+            </wp:cNvGraphicFramePr>
+            <a:graphic>
+              <a:graphicData uri="http://schemas.openxmlformats.org/drawingml/2006/picture">
+                <pic:pic>
+                  <pic:nvPicPr>
+                    <pic:cNvPr id="21" name="fig_a1_05_federated_flower_client.png"/>
+                    <pic:cNvPicPr/>
+                  </pic:nvPicPr>
+                  <pic:blipFill>
+                    <a:blip r:embed="rId29"/>
+                    <a:stretch>
+                      <a:fillRect/>
+                    </a:stretch>
+                  </pic:blipFill>
+                  <pic:spPr>
+                    <a:xfrm>
+                      <a:off x="0" y="0"/>
+                      <a:ext cx="5029200" cy="5535548"/>
+                    </a:xfrm>
+                    <a:prstGeom prst="rect"/>
+                  </pic:spPr>
+                </pic:pic>
+              </a:graphicData>
+            </a:graphic>
+          </wp:inline>
+        </w:drawing>
+      </w:r>
+    </w:p>
+    <w:p>
+      <w:pPr>
+        <w:pStyle w:val="Caption"/>
+      </w:pPr>
+      <w:r>
+        <w:t>Figure A1-5 — Federated learning CLI: Flower server vs. client, local data, `GNNFlowerClient`. Source: `src/federated/run_federated.py`, lines 28–71.</w:t>
+      </w:r>
+    </w:p>
+    <w:p>
+      <w:r>
+        <w:t>Caption (formal): Figure A1-5 — main in run_federated.py: loads YAML config; server mode calls run_fl_server with round count and quorum; client mode loads client_{cid}_graphs.pt, builds train/validation sequence loaders, constructs GNNFlowerClient, and connects to 127.0.0.1:8080 via fl.client.start_numpy_client.</w:t>
+      </w:r>
+    </w:p>
+    <w:p>
+      <w:r>
+        <w:t>How to interpret: This file is the student-facing entry point for Chapter 8 federated results: each client trains only on its partition (non-IID split from src.federated.data_split, referenced in Appendix C). The address and round counts come from config/experiment.yaml under fl. The pattern matches the FedAvg narrative in Chapter 2—local epochs, then aggregation on the server (server implementation in src/federated/server.py, not shown).</w:t>
+      </w:r>
+    </w:p>
+    <w:p>
+      <w:r>
+        <w:drawing>
+          <wp:inline xmlns:a="http://schemas.openxmlformats.org/drawingml/2006/main" xmlns:pic="http://schemas.openxmlformats.org/drawingml/2006/picture">
+            <wp:extent cx="5029200" cy="7125799"/>
+            <wp:docPr id="22" name="Picture 22"/>
+            <wp:cNvGraphicFramePr>
+              <a:graphicFrameLocks noChangeAspect="1"/>
+            </wp:cNvGraphicFramePr>
+            <a:graphic>
+              <a:graphicData uri="http://schemas.openxmlformats.org/drawingml/2006/picture">
+                <pic:pic>
+                  <pic:nvPicPr>
+                    <pic:cNvPr id="22" name="fig_a1_06_fastapi_score_alert.png"/>
+                    <pic:cNvPicPr/>
+                  </pic:nvPicPr>
+                  <pic:blipFill>
+                    <a:blip r:embed="rId30"/>
+                    <a:stretch>
+                      <a:fillRect/>
+                    </a:stretch>
+                  </pic:blipFill>
+                  <pic:spPr>
+                    <a:xfrm>
+                      <a:off x="0" y="0"/>
+                      <a:ext cx="5029200" cy="7125799"/>
+                    </a:xfrm>
+                    <a:prstGeom prst="rect"/>
+                  </pic:spPr>
+                </pic:pic>
+              </a:graphicData>
+            </a:graphic>
+          </wp:inline>
+        </w:drawing>
+      </w:r>
+    </w:p>
+    <w:p>
+      <w:pPr>
+        <w:pStyle w:val="Caption"/>
+      </w:pPr>
+      <w:r>
+        <w:t>Figure A1-6 — HTTP API: load checkpoint, `/score` builds graphs, runs `explain_sequence`, returns ECS-style alert JSON. Source: `src/siem/api.py`, lines 32–89.</w:t>
+      </w:r>
+    </w:p>
+    <w:p>
+      <w:r>
+        <w:t>Caption (formal): Figure A1-6 — FastAPI application: startup loads experiment.yaml and dynamic_gnn_best.pt; POST /score accepts a list of flow windows, reads graph.knn_k from the loaded config for flows_to_knn_graph, runs explain_sequence with top-5 nodes and features, measures wall-clock milliseconds, and returns format_ecs_alert output alongside prediction and score.</w:t>
+      </w:r>
+    </w:p>
+    <w:p>
+      <w:r>
+        <w:t>How to interpret: This is the edge deployment surface argued in Chapters 1 and 5: a single HTTP call turns raw feature windows into SIEM-shaped JSON suitable for triage. Inference-time kNN k therefore matches training graph construction from config/experiment.yaml, avoiding train/serve skew. Latency reported in Chapter 8 is consistent with this synchronous CPU path.</w:t>
+      </w:r>
+    </w:p>
+    <w:p>
+      <w:pPr>
+        <w:pStyle w:val="Heading2"/>
+      </w:pPr>
+      <w:r>
+        <w:t>Appendix E: Handbook Appendix 4 (optional) — repository, dataset, demonstration</w:t>
+      </w:r>
+    </w:p>
+    <w:p>
+      <w:r>
+        <w:t>The programme allows an optional fourth appendix: a GitHub link to project code (and any data you host there), or a video of the system with a OneDrive or YouTube link. This appendix records what applies to this submission; URLs match the actual remote and the official dataset distributor at the time of writing.</w:t>
+      </w:r>
+    </w:p>
+    <w:p>
+      <w:pPr>
+        <w:pStyle w:val="Heading3"/>
+      </w:pPr>
+      <w:r>
+        <w:t>E.1 Project source code (GitHub)</w:t>
+      </w:r>
+    </w:p>
+    <w:p>
+      <w:r>
+        <w:t>The prototype code for this dissertation is available in a public Git repository (this is the origin remote of the working tree used to produce the reported results):</w:t>
+      </w:r>
+    </w:p>
+    <w:p>
+      <w:r>
+        <w:t xml:space="preserve">- Repository: https://github.com/imark0007/Dissertation_Project  </w:t>
+      </w:r>
+    </w:p>
+    <w:p>
+      <w:r>
+        <w:t>It contains src/, scripts/, config/, requirements.txt, README.md, and SETUP_AND_RUN.md. Clone the default branch and follow Appendix C to re-run training and evaluation.</w:t>
+      </w:r>
+    </w:p>
+    <w:p>
+      <w:pPr>
+        <w:pStyle w:val="Heading3"/>
+      </w:pPr>
+      <w:r>
+        <w:t>E.2 Dataset (official source; not bundled in GitHub)</w:t>
+      </w:r>
+    </w:p>
+    <w:p>
+      <w:r>
+        <w:t>The experiments use CICIoT2023 (Pinto et al., 2023). The full corpus is not committed to the GitHub repository (size and licence). Download it from the Canadian Institute for Cybersecurity (CIC), University of New Brunswick:</w:t>
+      </w:r>
+    </w:p>
+    <w:p>
+      <w:r>
+        <w:t xml:space="preserve">- Dataset page: https://www.unb.ca/cic/datasets/iotdataset-2023.html  </w:t>
+      </w:r>
+    </w:p>
+    <w:p>
+      <w:r>
+        <w:t>The dataset paper is cited in Chapter 11 (DOI: https://doi.org/10.3390/s23135941). Preprocessing in this project expects the user to place downloaded files according to SETUP_AND_RUN.md.</w:t>
+      </w:r>
+    </w:p>
+    <w:p>
+      <w:pPr>
+        <w:pStyle w:val="Heading3"/>
+      </w:pPr>
+      <w:r>
+        <w:t>E.3 Optional demonstration video (OneDrive / YouTube)</w:t>
+      </w:r>
+    </w:p>
+    <w:p>
+      <w:r>
+        <w:t>No narrated walkthrough video was submitted with this dissertation; assessment relies on the GitHub repository (E.1), Appendix C, and the figures and tables in the main text. If you record a video later, replace the following line with a single public OneDrive or YouTube URL and update the Word/PDF:</w:t>
+      </w:r>
+    </w:p>
+    <w:p>
+      <w:r>
+        <w:t>- Demonstration video: Not included.</w:t>
+      </w:r>
+    </w:p>
+    <w:p>
       <w:r>
         <w:br w:type="page"/>
       </w:r>
@@ -7577,7 +8542,12 @@
         <w:pStyle w:val="Heading1"/>
       </w:pPr>
       <w:r>
-        <w:t>Appendix A: Project Process Documentation</w:t>
+        <w:t>Full text — Project process documentation (embedded)</w:t>
+      </w:r>
+    </w:p>
+    <w:p>
+      <w:r>
+        <w:t>Corresponds to the file named in Appendix A of the body. This section is merged automatically; keep page breaks if you re-order for School templates.</w:t>
       </w:r>
     </w:p>
     <w:p>
@@ -8569,7 +9539,12 @@
         <w:pStyle w:val="Heading1"/>
       </w:pPr>
       <w:r>
-        <w:t>Appendix B: Attendance Log</w:t>
+        <w:t>Full text — Attendance log (embedded)</w:t>
+      </w:r>
+    </w:p>
+    <w:p>
+      <w:r>
+        <w:t>Corresponds to the file named in Appendix A of the body.</w:t>
       </w:r>
     </w:p>
     <w:p>
@@ -8609,7 +9584,7 @@
                 <wp:extent cx="5467350" cy="333375"/>
                 <wp:effectExtent l="0" t="0" r="0" b="0"/>
                 <wp:wrapNone/>
-                <wp:docPr id="17" name=" 5"/>
+                <wp:docPr id="23" name=" 5"/>
                 <wp:cNvGraphicFramePr/>
                 <a:graphic xmlns:a="http://schemas.openxmlformats.org/drawingml/2006/main">
                   <a:graphicData uri="http://schemas.microsoft.com/office/word/2010/wordprocessingShape">
@@ -8716,7 +9691,7 @@
                 <wp:extent cx="5953125" cy="457200"/>
                 <wp:effectExtent l="0" t="0" r="0" b="0"/>
                 <wp:wrapNone/>
-                <wp:docPr id="18" name=" 4"/>
+                <wp:docPr id="24" name=" 4"/>
                 <wp:cNvGraphicFramePr/>
                 <a:graphic xmlns:a="http://schemas.openxmlformats.org/drawingml/2006/main">
                   <a:graphicData uri="http://schemas.microsoft.com/office/word/2010/wordprocessingShape">
@@ -8795,17 +9770,17 @@
             <wp:extent cx="1997075" cy="304800"/>
             <wp:effectExtent l="0" t="0" r="0" b="0"/>
             <wp:wrapNone/>
-            <wp:docPr id="19" name="Picture 2"/>
+            <wp:docPr id="25" name="Picture 2"/>
             <wp:cNvGraphicFramePr/>
             <a:graphic xmlns:a="http://schemas.openxmlformats.org/drawingml/2006/main">
               <a:graphicData uri="http://schemas.openxmlformats.org/drawingml/2006/picture">
                 <pic:pic xmlns:pic="http://schemas.openxmlformats.org/drawingml/2006/picture">
                   <pic:nvPicPr>
-                    <pic:cNvPr id="17" name="Picture 2"/>
+                    <pic:cNvPr id="23" name="Picture 2"/>
                     <pic:cNvPicPr/>
                   </pic:nvPicPr>
                   <pic:blipFill>
-                    <a:blip r:embed="rId26" cstate="print">
+                    <a:blip r:embed="rId32" cstate="print">
                       <a:clrChange>
                         <a:clrFrom>
                           <a:srgbClr val="FFFFFF"/>
@@ -10776,7 +11751,7 @@
                 <wp:inline distT="0" distB="0" distL="0" distR="0" wp14:anchorId="1E6D63AB" wp14:editId="6B962319">
                   <wp:extent cx="656981" cy="480102"/>
                   <wp:effectExtent l="0" t="0" r="0" b="0"/>
-                  <wp:docPr id="20" name="Picture 1"/>
+                  <wp:docPr id="26" name="Picture 1"/>
                   <wp:cNvGraphicFramePr>
                     <a:graphicFrameLocks xmlns:a="http://schemas.openxmlformats.org/drawingml/2006/main" noChangeAspect="1"/>
                   </wp:cNvGraphicFramePr>
@@ -10784,11 +11759,11 @@
                     <a:graphicData uri="http://schemas.openxmlformats.org/drawingml/2006/picture">
                       <pic:pic xmlns:pic="http://schemas.openxmlformats.org/drawingml/2006/picture">
                         <pic:nvPicPr>
-                          <pic:cNvPr id="18" name=""/>
+                          <pic:cNvPr id="24" name=""/>
                           <pic:cNvPicPr/>
                         </pic:nvPicPr>
                         <pic:blipFill>
-                          <a:blip r:embed="rId27">
+                          <a:blip r:embed="rId33">
                             <a:extLst>
                               <a:ext uri="{28A0092B-C50C-407E-A947-70E740481C1C}">
                                 <a14:useLocalDpi xmlns:a14="http://schemas.microsoft.com/office/drawing/2010/main" val="0"/>
@@ -10984,7 +11959,12 @@
         <w:pStyle w:val="Heading1"/>
       </w:pPr>
       <w:r>
-        <w:t>Appendix C: Project Specification</w:t>
+        <w:t>Full text — Agreed project specification (embedded)</w:t>
+      </w:r>
+    </w:p>
+    <w:p>
+      <w:r>
+        <w:t>Corresponds to the file named in Appendix B of the body.</w:t>
       </w:r>
     </w:p>
     <w:p>
@@ -13779,7 +14759,7 @@
               </w:rPr>
               <w:t xml:space="preserve">, [online] 14(4), p.78. Available at: </w:t>
             </w:r>
-            <w:hyperlink r:id="rId28" w:tgtFrame="_new" w:history="1">
+            <w:hyperlink r:id="rId34" w:tgtFrame="_new" w:history="1">
               <w:r>
                 <w:rPr>
                   <w:rStyle w:val="Hyperlink"/>
@@ -13901,7 +14881,7 @@
               </w:rPr>
               <w:t xml:space="preserve">, 25(3), p.847. Available at: </w:t>
             </w:r>
-            <w:hyperlink r:id="rId29" w:tgtFrame="_new" w:history="1">
+            <w:hyperlink r:id="rId35" w:tgtFrame="_new" w:history="1">
               <w:r>
                 <w:rPr>
                   <w:rStyle w:val="Hyperlink"/>
@@ -13977,7 +14957,7 @@
               </w:rPr>
               <w:t xml:space="preserve">, 15(9), p.5002. Available at: </w:t>
             </w:r>
-            <w:hyperlink r:id="rId30" w:tgtFrame="_new" w:history="1">
+            <w:hyperlink r:id="rId36" w:tgtFrame="_new" w:history="1">
               <w:r>
                 <w:rPr>
                   <w:rStyle w:val="Hyperlink"/>
@@ -14035,7 +15015,7 @@
               </w:rPr>
               <w:t xml:space="preserve">, [online] 14(7), p.1391. Available at: </w:t>
             </w:r>
-            <w:hyperlink r:id="rId31" w:tgtFrame="_new" w:history="1">
+            <w:hyperlink r:id="rId37" w:tgtFrame="_new" w:history="1">
               <w:r>
                 <w:rPr>
                   <w:rStyle w:val="Hyperlink"/>
@@ -14121,7 +15101,7 @@
               </w:rPr>
               <w:t xml:space="preserve">, [online] 4(3), pp.509–530. Available at: </w:t>
             </w:r>
-            <w:hyperlink r:id="rId32" w:tgtFrame="_new" w:history="1">
+            <w:hyperlink r:id="rId38" w:tgtFrame="_new" w:history="1">
               <w:r>
                 <w:rPr>
                   <w:rStyle w:val="Hyperlink"/>
@@ -14189,7 +15169,7 @@
               </w:rPr>
               <w:t xml:space="preserve">, 6(4), p.165. Available at: </w:t>
             </w:r>
-            <w:hyperlink r:id="rId33" w:tgtFrame="_new" w:history="1">
+            <w:hyperlink r:id="rId39" w:tgtFrame="_new" w:history="1">
               <w:r>
                 <w:rPr>
                   <w:rStyle w:val="Hyperlink"/>
@@ -14265,7 +15245,7 @@
               </w:rPr>
               <w:t xml:space="preserve">, 16(6), p.499. Available at: </w:t>
             </w:r>
-            <w:hyperlink r:id="rId34" w:tgtFrame="_new" w:history="1">
+            <w:hyperlink r:id="rId40" w:tgtFrame="_new" w:history="1">
               <w:r>
                 <w:rPr>
                   <w:rStyle w:val="Hyperlink"/>
@@ -14323,7 +15303,7 @@
               </w:rPr>
               <w:t xml:space="preserve">, 23(13), pp.5941–5941. Available at: </w:t>
             </w:r>
-            <w:hyperlink r:id="rId35" w:tgtFrame="_new" w:history="1">
+            <w:hyperlink r:id="rId41" w:tgtFrame="_new" w:history="1">
               <w:r>
                 <w:rPr>
                   <w:rStyle w:val="Hyperlink"/>
@@ -14381,7 +15361,7 @@
               </w:rPr>
               <w:t xml:space="preserve">, 9(11), p.270. Available at: </w:t>
             </w:r>
-            <w:hyperlink r:id="rId36" w:tgtFrame="_new" w:history="1">
+            <w:hyperlink r:id="rId42" w:tgtFrame="_new" w:history="1">
               <w:r>
                 <w:rPr>
                   <w:rStyle w:val="Hyperlink"/>
@@ -14431,7 +15411,7 @@
               </w:rPr>
               <w:t xml:space="preserve">, [online] 17(7), pp.997–997. Available at: </w:t>
             </w:r>
-            <w:hyperlink r:id="rId37" w:tgtFrame="_new" w:history="1">
+            <w:hyperlink r:id="rId43" w:tgtFrame="_new" w:history="1">
               <w:r>
                 <w:rPr>
                   <w:rStyle w:val="Hyperlink"/>
@@ -14481,7 +15461,7 @@
               </w:rPr>
               <w:t xml:space="preserve">, 141, pp.103821–103821. Available at: </w:t>
             </w:r>
-            <w:hyperlink r:id="rId38" w:tgtFrame="_new" w:history="1">
+            <w:hyperlink r:id="rId44" w:tgtFrame="_new" w:history="1">
               <w:r>
                 <w:rPr>
                   <w:rStyle w:val="Hyperlink"/>
@@ -15782,7 +16762,7 @@
             <wp:extent cx="606540" cy="341997"/>
             <wp:effectExtent l="0" t="0" r="3175" b="1270"/>
             <wp:wrapNone/>
-            <wp:docPr id="21" name="Picture 3"/>
+            <wp:docPr id="27" name="Picture 3"/>
             <wp:cNvGraphicFramePr>
               <a:graphicFrameLocks xmlns:a="http://schemas.openxmlformats.org/drawingml/2006/main" noChangeAspect="1"/>
             </wp:cNvGraphicFramePr>
@@ -15790,11 +16770,11 @@
               <a:graphicData uri="http://schemas.openxmlformats.org/drawingml/2006/picture">
                 <pic:pic xmlns:pic="http://schemas.openxmlformats.org/drawingml/2006/picture">
                   <pic:nvPicPr>
-                    <pic:cNvPr id="19" name="signature.jpg"/>
+                    <pic:cNvPr id="25" name="signature.jpg"/>
                     <pic:cNvPicPr/>
                   </pic:nvPicPr>
                   <pic:blipFill>
-                    <a:blip r:embed="rId27">
+                    <a:blip r:embed="rId33">
                       <a:extLst>
                         <a:ext uri="{28A0092B-C50C-407E-A947-70E740481C1C}">
                           <a14:useLocalDpi xmlns:a14="http://schemas.microsoft.com/office/drawing/2010/main" val="0"/>
@@ -16002,11 +16982,11 @@
                 <wp:extent cx="665345" cy="356235"/>
                 <wp:effectExtent l="57150" t="57150" r="1905" b="43815"/>
                 <wp:wrapNone/>
-                <wp:docPr id="22" name="Ink 3"/>
+                <wp:docPr id="28" name="Ink 3"/>
                 <wp:cNvGraphicFramePr/>
                 <a:graphic xmlns:a="http://schemas.openxmlformats.org/drawingml/2006/main">
                   <a:graphicData uri="http://schemas.microsoft.com/office/word/2010/wordprocessingInk">
-                    <w14:contentPart bwMode="auto" r:id="rId39">
+                    <w14:contentPart bwMode="auto" r:id="rId45">
                       <w14:nvContentPartPr>
                         <w14:cNvContentPartPr/>
                       </w14:nvContentPartPr>
@@ -16042,7 +17022,7 @@
                 <o:lock v:ext="edit" aspectratio="t"/>
               </v:shapetype>
               <v:shape id="Ink 3" o:spid="_x0000_s1026" type="#_x0000_t75" style="position:absolute;margin-left:52.85pt;margin-top:-3.25pt;width:53.85pt;height:29.45pt;z-index:251661312;visibility:visible;mso-wrap-style:square;mso-wrap-distance-left:9pt;mso-wrap-distance-top:0;mso-wrap-distance-right:9pt;mso-wrap-distance-bottom:0;mso-position-horizontal:absolute;mso-position-horizontal-relative:text;mso-position-vertical:absolute;mso-position-vertical-relative:text" o:gfxdata="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">
-                <v:imagedata r:id="rId40" o:title=""/>
+                <v:imagedata r:id="rId46" o:title=""/>
               </v:shape>
             </w:pict>
           </mc:Fallback>
@@ -16245,7 +17225,7 @@
       </w:pPr>
     </w:p>
     <w:sectPr>
-      <w:footerReference w:type="default" r:id="rId25"/>
+      <w:footerReference w:type="default" r:id="rId31"/>
       <w:pgSz w:w="12240" w:h="15840"/>
       <w:pgMar w:top="1440" w:right="1800" w:bottom="1440" w:left="1800" w:header="720" w:footer="720" w:gutter="0"/>
       <w:cols w:space="720"/>
@@ -16445,7 +17425,7 @@
     </w:lvl>
   </w:abstractNum>
   <w:abstractNum xmlns:w15="http://schemas.microsoft.com/office/word/2012/wordml" w:abstractNumId="9" w15:restartNumberingAfterBreak="0">
-    <w:nsid w:val="01863EAC"/>
+    <w:nsid w:val="0351030C"/>
     <w:multiLevelType w:val="hybridMultilevel"/>
     <w:tmpl w:val="21FE9830"/>
     <w:lvl w:ilvl="0" w:tplc="497C7496">
@@ -16557,7 +17537,7 @@
     </w:lvl>
   </w:abstractNum>
   <w:abstractNum xmlns:w15="http://schemas.microsoft.com/office/word/2012/wordml" w:abstractNumId="10" w15:restartNumberingAfterBreak="0">
-    <w:nsid w:val="0590674B"/>
+    <w:nsid w:val="040A7320"/>
     <w:multiLevelType w:val="hybridMultilevel"/>
     <w:tmpl w:val="3870A1DA"/>
     <w:lvl w:ilvl="0" w:tplc="87DC84F8">
@@ -16650,7 +17630,7 @@
     </w:lvl>
   </w:abstractNum>
   <w:abstractNum xmlns:w15="http://schemas.microsoft.com/office/word/2012/wordml" w:abstractNumId="10" w15:restartNumberingAfterBreak="0">
-    <w:nsid w:val="03D2DC45"/>
+    <w:nsid w:val="01A459BE"/>
     <w:multiLevelType w:val="hybridMultilevel"/>
     <w:tmpl w:val="DEC25EB6"/>
     <w:lvl w:ilvl="0" w:tplc="04090001">
@@ -16763,7 +17743,7 @@
     </w:lvl>
   </w:abstractNum>
   <w:abstractNum xmlns:w15="http://schemas.microsoft.com/office/word/2012/wordml" w:abstractNumId="10" w15:restartNumberingAfterBreak="0">
-    <w:nsid w:val="02ADBAB5"/>
+    <w:nsid w:val="02446AED"/>
     <w:multiLevelType w:val="hybridMultilevel"/>
     <w:tmpl w:val="328A2E02"/>
     <w:lvl w:ilvl="0" w:tplc="04090001">
@@ -16877,7 +17857,7 @@
     </w:lvl>
   </w:abstractNum>
   <w:abstractNum xmlns:w15="http://schemas.microsoft.com/office/word/2012/wordml" w:abstractNumId="10" w15:restartNumberingAfterBreak="0">
-    <w:nsid w:val="00015541"/>
+    <w:nsid w:val="01A0D1DF"/>
     <w:multiLevelType w:val="hybridMultilevel"/>
     <w:tmpl w:val="6BEE1C8C"/>
     <w:lvl w:ilvl="0" w:tplc="04090001">
@@ -16990,7 +17970,7 @@
     </w:lvl>
   </w:abstractNum>
   <w:abstractNum xmlns:w15="http://schemas.microsoft.com/office/word/2012/wordml" w:abstractNumId="10" w15:restartNumberingAfterBreak="0">
-    <w:nsid w:val="026FE019"/>
+    <w:nsid w:val="002D79EE"/>
     <w:multiLevelType w:val="hybridMultilevel"/>
     <w:tmpl w:val="10B2FFDC"/>
     <w:lvl w:ilvl="0" w:tplc="04090001">
@@ -17103,7 +18083,7 @@
     </w:lvl>
   </w:abstractNum>
   <w:abstractNum xmlns:w15="http://schemas.microsoft.com/office/word/2012/wordml" w:abstractNumId="10" w15:restartNumberingAfterBreak="0">
-    <w:nsid w:val="00912023"/>
+    <w:nsid w:val="0129B191"/>
     <w:multiLevelType w:val="hybridMultilevel"/>
     <w:tmpl w:val="2D2A33EC"/>
     <w:lvl w:ilvl="0" w:tplc="04090001">
@@ -17216,7 +18196,7 @@
     </w:lvl>
   </w:abstractNum>
   <w:abstractNum xmlns:w15="http://schemas.microsoft.com/office/word/2012/wordml" w:abstractNumId="10" w15:restartNumberingAfterBreak="0">
-    <w:nsid w:val="00C53667"/>
+    <w:nsid w:val="013760A6"/>
     <w:multiLevelType w:val="hybridMultilevel"/>
     <w:tmpl w:val="6050746C"/>
     <w:lvl w:ilvl="0" w:tplc="04090001">
@@ -17329,7 +18309,7 @@
     </w:lvl>
   </w:abstractNum>
   <w:abstractNum xmlns:w15="http://schemas.microsoft.com/office/word/2012/wordml" w:abstractNumId="10" w15:restartNumberingAfterBreak="0">
-    <w:nsid w:val="0022204B"/>
+    <w:nsid w:val="037C9A28"/>
     <w:multiLevelType w:val="hybridMultilevel"/>
     <w:tmpl w:val="A81CB856"/>
     <w:lvl w:ilvl="0" w:tplc="04090001">
@@ -17442,7 +18422,7 @@
     </w:lvl>
   </w:abstractNum>
   <w:abstractNum xmlns:w15="http://schemas.microsoft.com/office/word/2012/wordml" w:abstractNumId="10" w15:restartNumberingAfterBreak="0">
-    <w:nsid w:val="02B1C644"/>
+    <w:nsid w:val="0389B777"/>
     <w:multiLevelType w:val="hybridMultilevel"/>
     <w:tmpl w:val="17383036"/>
     <w:lvl w:ilvl="0" w:tplc="04090001">
@@ -17555,7 +18535,7 @@
     </w:lvl>
   </w:abstractNum>
   <w:abstractNum xmlns:w15="http://schemas.microsoft.com/office/word/2012/wordml" w:abstractNumId="11" w15:restartNumberingAfterBreak="0">
-    <w:nsid w:val="053AD9B7"/>
+    <w:nsid w:val="048C178E"/>
     <w:multiLevelType w:val="hybridMultilevel"/>
     <w:tmpl w:val="3EDAB924"/>
     <w:lvl w:ilvl="0" w:tplc="A050AA90">
@@ -18021,12 +19001,13 @@
       <w:outlineLvl w:val="3"/>
     </w:pPr>
     <w:rPr>
-      <w:rFonts w:asciiTheme="majorHAnsi" w:eastAsiaTheme="majorEastAsia" w:hAnsiTheme="majorHAnsi" w:cstheme="majorBidi"/>
+      <w:rFonts w:asciiTheme="majorHAnsi" w:eastAsiaTheme="majorEastAsia" w:hAnsiTheme="majorHAnsi" w:cstheme="majorBidi" w:ascii="Arial" w:hAnsi="Arial"/>
       <w:b/>
       <w:bCs/>
       <w:i/>
       <w:iCs/>
       <w:color w:val="4F81BD" w:themeColor="accent1"/>
+      <w:sz w:val="24"/>
     </w:rPr>
   </w:style>
   <w:style w:type="paragraph" w:styleId="Heading5">

</xml_diff>

<commit_message>
Supervisor final-feedback pack: checklists, compliance report, spec copy, abstract 200w
- Add docs/reports/SUPERVISOR_FINAL_FEEDBACK.md and sync to supervisor package
- Rewrite SUBMISSION_CHECKLIST (correct chapter mapping, appendix A-E table, ablation in Ch8)
- Refresh HANDBOOK_COMPLIANCE_REPORT (counts, chapter refs, appendices D/E, Full text embeds)
- Trim abstract to exactly 200 words; add scripts/count_dissertation_words.py
- Copy signed specification into 05_Appendix_documents; update ADD_SIGNED note
- Update package README; regenerate Word and sync 01_Dissertation

Made-with: Cursor
</commit_message>
<xml_diff>
--- a/Arka_Talukder_Dissertation_Final.docx
+++ b/Arka_Talukder_Dissertation_Final.docx
@@ -124,7 +124,7 @@
     </w:p>
     <w:p>
       <w:r>
-        <w:t>A dynamic GNN (GAT + GRU over kNN flow graphs) is trained with Flower FedAvg (three clients); Captum attributions and attention cues feed ECS-like alerts from FastAPI. Chapter 8 reports 100% test F1 and ROC-AUC for centralised and federated GNN on the fixed subset, fewer false alarms than Random Forest on the same split, about 22.7 ms CPU inference per sequence, about 31 MB federated messaging over ten rounds, plus ablation, sensitivity, and multi-seed checks. Scope is a 45-day MSc build; limitations and future work are in Chapter 9.</w:t>
+        <w:t>A dynamic GNN (GAT + GRU over kNN flow graphs) is trained with Flower FedAvg (three clients); Captum attributions and attention cues feed ECS-like alerts from FastAPI. Chapter 8 reports 100% test F1 and ROC-AUC for centralised and federated GNN on the fixed subset, fewer false alarms than Random Forest on the same split, 22.7 ms CPU inference per sequence, 31 MB federated messaging over ten rounds, plus ablation, sensitivity, and multi-seed checks. Limitations and future work are in Chapter 9.</w:t>
       </w:r>
     </w:p>
     <w:p>
@@ -17425,7 +17425,7 @@
     </w:lvl>
   </w:abstractNum>
   <w:abstractNum xmlns:w15="http://schemas.microsoft.com/office/word/2012/wordml" w:abstractNumId="9" w15:restartNumberingAfterBreak="0">
-    <w:nsid w:val="0351030C"/>
+    <w:nsid w:val="0468BF7D"/>
     <w:multiLevelType w:val="hybridMultilevel"/>
     <w:tmpl w:val="21FE9830"/>
     <w:lvl w:ilvl="0" w:tplc="497C7496">
@@ -17537,7 +17537,7 @@
     </w:lvl>
   </w:abstractNum>
   <w:abstractNum xmlns:w15="http://schemas.microsoft.com/office/word/2012/wordml" w:abstractNumId="10" w15:restartNumberingAfterBreak="0">
-    <w:nsid w:val="040A7320"/>
+    <w:nsid w:val="01CB6711"/>
     <w:multiLevelType w:val="hybridMultilevel"/>
     <w:tmpl w:val="3870A1DA"/>
     <w:lvl w:ilvl="0" w:tplc="87DC84F8">
@@ -17630,7 +17630,7 @@
     </w:lvl>
   </w:abstractNum>
   <w:abstractNum xmlns:w15="http://schemas.microsoft.com/office/word/2012/wordml" w:abstractNumId="10" w15:restartNumberingAfterBreak="0">
-    <w:nsid w:val="01A459BE"/>
+    <w:nsid w:val="048084D4"/>
     <w:multiLevelType w:val="hybridMultilevel"/>
     <w:tmpl w:val="DEC25EB6"/>
     <w:lvl w:ilvl="0" w:tplc="04090001">
@@ -17743,7 +17743,7 @@
     </w:lvl>
   </w:abstractNum>
   <w:abstractNum xmlns:w15="http://schemas.microsoft.com/office/word/2012/wordml" w:abstractNumId="10" w15:restartNumberingAfterBreak="0">
-    <w:nsid w:val="02446AED"/>
+    <w:nsid w:val="050A7578"/>
     <w:multiLevelType w:val="hybridMultilevel"/>
     <w:tmpl w:val="328A2E02"/>
     <w:lvl w:ilvl="0" w:tplc="04090001">
@@ -17857,7 +17857,7 @@
     </w:lvl>
   </w:abstractNum>
   <w:abstractNum xmlns:w15="http://schemas.microsoft.com/office/word/2012/wordml" w:abstractNumId="10" w15:restartNumberingAfterBreak="0">
-    <w:nsid w:val="01A0D1DF"/>
+    <w:nsid w:val="05A04861"/>
     <w:multiLevelType w:val="hybridMultilevel"/>
     <w:tmpl w:val="6BEE1C8C"/>
     <w:lvl w:ilvl="0" w:tplc="04090001">
@@ -17970,7 +17970,7 @@
     </w:lvl>
   </w:abstractNum>
   <w:abstractNum xmlns:w15="http://schemas.microsoft.com/office/word/2012/wordml" w:abstractNumId="10" w15:restartNumberingAfterBreak="0">
-    <w:nsid w:val="002D79EE"/>
+    <w:nsid w:val="0191F0F0"/>
     <w:multiLevelType w:val="hybridMultilevel"/>
     <w:tmpl w:val="10B2FFDC"/>
     <w:lvl w:ilvl="0" w:tplc="04090001">
@@ -18083,7 +18083,7 @@
     </w:lvl>
   </w:abstractNum>
   <w:abstractNum xmlns:w15="http://schemas.microsoft.com/office/word/2012/wordml" w:abstractNumId="10" w15:restartNumberingAfterBreak="0">
-    <w:nsid w:val="0129B191"/>
+    <w:nsid w:val="03A76ED0"/>
     <w:multiLevelType w:val="hybridMultilevel"/>
     <w:tmpl w:val="2D2A33EC"/>
     <w:lvl w:ilvl="0" w:tplc="04090001">
@@ -18196,7 +18196,7 @@
     </w:lvl>
   </w:abstractNum>
   <w:abstractNum xmlns:w15="http://schemas.microsoft.com/office/word/2012/wordml" w:abstractNumId="10" w15:restartNumberingAfterBreak="0">
-    <w:nsid w:val="013760A6"/>
+    <w:nsid w:val="0407EA1C"/>
     <w:multiLevelType w:val="hybridMultilevel"/>
     <w:tmpl w:val="6050746C"/>
     <w:lvl w:ilvl="0" w:tplc="04090001">
@@ -18309,7 +18309,7 @@
     </w:lvl>
   </w:abstractNum>
   <w:abstractNum xmlns:w15="http://schemas.microsoft.com/office/word/2012/wordml" w:abstractNumId="10" w15:restartNumberingAfterBreak="0">
-    <w:nsid w:val="037C9A28"/>
+    <w:nsid w:val="050198E9"/>
     <w:multiLevelType w:val="hybridMultilevel"/>
     <w:tmpl w:val="A81CB856"/>
     <w:lvl w:ilvl="0" w:tplc="04090001">
@@ -18422,7 +18422,7 @@
     </w:lvl>
   </w:abstractNum>
   <w:abstractNum xmlns:w15="http://schemas.microsoft.com/office/word/2012/wordml" w:abstractNumId="10" w15:restartNumberingAfterBreak="0">
-    <w:nsid w:val="0389B777"/>
+    <w:nsid w:val="00733532"/>
     <w:multiLevelType w:val="hybridMultilevel"/>
     <w:tmpl w:val="17383036"/>
     <w:lvl w:ilvl="0" w:tplc="04090001">
@@ -18535,7 +18535,7 @@
     </w:lvl>
   </w:abstractNum>
   <w:abstractNum xmlns:w15="http://schemas.microsoft.com/office/word/2012/wordml" w:abstractNumId="11" w15:restartNumberingAfterBreak="0">
-    <w:nsid w:val="048C178E"/>
+    <w:nsid w:val="03041363"/>
     <w:multiLevelType w:val="hybridMultilevel"/>
     <w:tmpl w:val="3EDAB924"/>
     <w:lvl w:ilvl="0" w:tplc="A050AA90">

</xml_diff>